<commit_message>
Update short drama public excerpt
</commit_message>
<xml_diff>
--- a/assets/docs/short-drama-script-ep1-3.docx
+++ b/assets/docs/short-drama-script-ep1-3.docx
@@ -5,11 +5,10 @@
     <w:p>
       <w:pPr>
         <w:spacing w:before="400" w:after="40"/>
-        <w:jc w:val="left"/>
       </w:pPr>
       <w:r>
         <w:rPr>
-          <w:rFonts w:ascii="STKaiti" w:hAnsi="STKaiti" w:eastAsia="STKaiti"/>
+          <w:rFonts w:ascii="Arial Unicode MS" w:hAnsi="Arial Unicode MS" w:eastAsia="Arial Unicode MS"/>
           <w:b/>
           <w:i w:val="0"/>
           <w:color w:val="222222"/>
@@ -20,92 +19,330 @@
     </w:p>
     <w:p>
       <w:pPr>
-        <w:spacing w:after="360"/>
+        <w:spacing w:after="400"/>
       </w:pPr>
       <w:r>
         <w:rPr>
-          <w:rFonts w:ascii="STSong" w:hAnsi="STSong" w:eastAsia="STSong"/>
+          <w:rFonts w:ascii="Arial Unicode MS" w:hAnsi="Arial Unicode MS" w:eastAsia="Arial Unicode MS"/>
           <w:b/>
           <w:i w:val="0"/>
           <w:color w:val="A86543"/>
           <w:sz w:val="21"/>
         </w:rPr>
-        <w:t>网站公开节选  /  EP1—EP3</w:t>
+        <w:t>网站公开版  /  故事梗概 · 人物小传 · EP1—EP3 英文剧本</w:t>
       </w:r>
     </w:p>
     <w:p>
       <w:pPr>
-        <w:spacing w:after="140"/>
+        <w:pStyle w:val="Heading1"/>
       </w:pPr>
       <w:r>
         <w:rPr>
-          <w:rFonts w:ascii="STSong" w:hAnsi="STSong" w:eastAsia="STSong"/>
+          <w:rFonts w:ascii="Arial Unicode MS" w:hAnsi="Arial Unicode MS" w:eastAsia="Arial Unicode MS"/>
           <w:b/>
           <w:i w:val="0"/>
-          <w:color w:val="A86543"/>
-          <w:sz w:val="21"/>
+          <w:color w:val="222222"/>
+          <w:sz w:val="38"/>
         </w:rPr>
-        <w:t xml:space="preserve">类型  </w:t>
+        <w:t>故事梗概</w:t>
       </w:r>
+    </w:p>
+    <w:p>
+      <w:pPr/>
       <w:r>
         <w:rPr>
-          <w:rFonts w:ascii="STSong" w:hAnsi="STSong" w:eastAsia="STSong"/>
+          <w:rFonts w:ascii="Arial Unicode MS" w:hAnsi="Arial Unicode MS" w:eastAsia="Arial Unicode MS"/>
           <w:b w:val="0"/>
           <w:i w:val="0"/>
           <w:color w:val="222222"/>
           <w:sz w:val="21"/>
         </w:rPr>
-        <w:t>校园恋爱 / 灵魂互换 / 欢喜冤家 / 假戏真做</w:t>
+        <w:t>Ivy 是靠奖学金进入贵族高中的普通女孩，聪明努力却自卑敏感，长期被暗恋的学生会会长Adrian 利用。Ryder 是校园风云人物，冰球队长，外表冷酷，内心却承受着家族和梦想的压力。一次错位的告白，一次意外的接吻，两人竟神秘交换了身体。为了隐藏秘密，正常生活，两人被迫互相帮助，在替对方解决麻烦的过程中逐渐理解彼此，也从最初的嫌弃变成心动。Ivy 进入Ryder的人生，发现光鲜的校草身份背后充满束缚的家族压力；Ryder进入Ivy的世界，第一次看到她承受的委屈和伤害。然而，Adrian和Sienna察觉两人的变化，开始试图揭开真相。当身份即将换回时，Ivy和Ryder必须面对选择，是回到原本的人生，还是勇敢承认真正的自己与爱。</w:t>
       </w:r>
     </w:p>
     <w:p>
       <w:pPr>
-        <w:spacing w:after="140"/>
+        <w:pStyle w:val="Heading1"/>
       </w:pPr>
       <w:r>
         <w:rPr>
-          <w:rFonts w:ascii="STSong" w:hAnsi="STSong" w:eastAsia="STSong"/>
+          <w:rFonts w:ascii="Arial Unicode MS" w:hAnsi="Arial Unicode MS" w:eastAsia="Arial Unicode MS"/>
+          <w:b/>
+          <w:i w:val="0"/>
+          <w:color w:val="222222"/>
+          <w:sz w:val="38"/>
+        </w:rPr>
+        <w:t>人物小传</w:t>
+      </w:r>
+    </w:p>
+    <w:p>
+      <w:pPr>
+        <w:pStyle w:val="Heading2"/>
+      </w:pPr>
+      <w:r>
+        <w:rPr>
+          <w:rFonts w:ascii="Arial Unicode MS" w:hAnsi="Arial Unicode MS" w:eastAsia="Arial Unicode MS"/>
           <w:b/>
           <w:i w:val="0"/>
           <w:color w:val="A86543"/>
-          <w:sz w:val="21"/>
+          <w:sz w:val="30"/>
         </w:rPr>
-        <w:t xml:space="preserve">体量  </w:t>
+        <w:t>Ivy Carter｜女主</w:t>
       </w:r>
+    </w:p>
+    <w:p>
+      <w:pPr/>
       <w:r>
         <w:rPr>
-          <w:rFonts w:ascii="STSong" w:hAnsi="STSong" w:eastAsia="STSong"/>
+          <w:rFonts w:ascii="Arial Unicode MS" w:hAnsi="Arial Unicode MS" w:eastAsia="Arial Unicode MS"/>
           <w:b w:val="0"/>
           <w:i w:val="0"/>
           <w:color w:val="222222"/>
           <w:sz w:val="21"/>
         </w:rPr>
-        <w:t>45集短剧，每集约1.5分钟</w:t>
+        <w:t>18岁，学霸、学生会成员。深棕色长发，常戴黑框眼镜，喜欢穿宽松毛衣和简单的衣服。</w:t>
       </w:r>
     </w:p>
     <w:p>
-      <w:pPr>
-        <w:spacing w:after="140"/>
-      </w:pPr>
+      <w:pPr/>
       <w:r>
         <w:rPr>
-          <w:rFonts w:ascii="STSong" w:hAnsi="STSong" w:eastAsia="STSong"/>
-          <w:b/>
-          <w:i w:val="0"/>
-          <w:color w:val="A86543"/>
-          <w:sz w:val="21"/>
-        </w:rPr>
-        <w:t xml:space="preserve">简介  </w:t>
-      </w:r>
-      <w:r>
-        <w:rPr>
-          <w:rFonts w:ascii="STSong" w:hAnsi="STSong" w:eastAsia="STSong"/>
+          <w:rFonts w:ascii="Arial Unicode MS" w:hAnsi="Arial Unicode MS" w:eastAsia="Arial Unicode MS"/>
           <w:b w:val="0"/>
           <w:i w:val="0"/>
           <w:color w:val="222222"/>
           <w:sz w:val="21"/>
         </w:rPr>
-        <w:t>奖学金女孩 Ivy 与校园冰球明星 Ryder 意外交换身体。为了隐藏秘密、保住各自的校园生活，两人被迫替对方解决麻烦，也在一次次失控的日常里重新认识彼此。</w:t>
+        <w:t>聪明优秀却极度自卑，习惯隐藏自己的需求，总是通过帮助别人获得认可。她获得Whitmore家族全额奖学金，来到贵族高中完成最后一个学年，并寄住在Whitmore家中。</w:t>
+      </w:r>
+    </w:p>
+    <w:p>
+      <w:pPr/>
+      <w:r>
+        <w:rPr>
+          <w:rFonts w:ascii="Arial Unicode MS" w:hAnsi="Arial Unicode MS" w:eastAsia="Arial Unicode MS"/>
+          <w:b w:val="0"/>
+          <w:i w:val="0"/>
+          <w:color w:val="222222"/>
+          <w:sz w:val="21"/>
+        </w:rPr>
+        <w:t>刚搬进Whitmore家时，Ivy误闯储藏间，引发严重幽闭恐惧症。危急时刻，一个男生出现抱住她安抚她，但由于黑暗中看不清对方的脸，她误以为救自己的人是Adrian，从此对他产生好感。实际上，真正救她的人是Ryder。</w:t>
+      </w:r>
+    </w:p>
+    <w:p>
+      <w:pPr/>
+      <w:r>
+        <w:rPr>
+          <w:rFonts w:ascii="Arial Unicode MS" w:hAnsi="Arial Unicode MS" w:eastAsia="Arial Unicode MS"/>
+          <w:b w:val="0"/>
+          <w:i w:val="0"/>
+          <w:color w:val="222222"/>
+          <w:sz w:val="21"/>
+        </w:rPr>
+        <w:t>Ivy长期被Adrian和Vanessa利用，为他们处理事务，却始终不敢反抗。一次意外，Ivy进入Adrian设计的陷阱，意外告白并亲吻了Ryder，两人因此交换身体，被迫体验另一个人的人生。</w:t>
+      </w:r>
+    </w:p>
+    <w:p>
+      <w:pPr/>
+      <w:r>
+        <w:rPr>
+          <w:rFonts w:ascii="Arial Unicode MS" w:hAnsi="Arial Unicode MS" w:eastAsia="Arial Unicode MS"/>
+          <w:b w:val="0"/>
+          <w:i w:val="0"/>
+          <w:color w:val="222222"/>
+          <w:sz w:val="21"/>
+        </w:rPr>
+        <w:t>从自卑讨好的“透明女孩”，成长为勇敢、自信、敢于掌控人生的女孩。</w:t>
+      </w:r>
+    </w:p>
+    <w:p>
+      <w:pPr>
+        <w:pStyle w:val="Heading2"/>
+      </w:pPr>
+      <w:r>
+        <w:rPr>
+          <w:rFonts w:ascii="Arial Unicode MS" w:hAnsi="Arial Unicode MS" w:eastAsia="Arial Unicode MS"/>
+          <w:b/>
+          <w:i w:val="0"/>
+          <w:color w:val="A86543"/>
+          <w:sz w:val="30"/>
+        </w:rPr>
+        <w:t>Ryder Whitmore｜男主</w:t>
+      </w:r>
+    </w:p>
+    <w:p>
+      <w:pPr/>
+      <w:r>
+        <w:rPr>
+          <w:rFonts w:ascii="Arial Unicode MS" w:hAnsi="Arial Unicode MS" w:eastAsia="Arial Unicode MS"/>
+          <w:b w:val="0"/>
+          <w:i w:val="0"/>
+          <w:color w:val="222222"/>
+          <w:sz w:val="21"/>
+        </w:rPr>
+        <w:t>18岁，校冰球队队长、州联赛MVP。黑发蓝眼，身材高大，是校园里最受欢迎的风云人物。</w:t>
+      </w:r>
+    </w:p>
+    <w:p>
+      <w:pPr/>
+      <w:r>
+        <w:rPr>
+          <w:rFonts w:ascii="Arial Unicode MS" w:hAnsi="Arial Unicode MS" w:eastAsia="Arial Unicode MS"/>
+          <w:b w:val="0"/>
+          <w:i w:val="0"/>
+          <w:color w:val="222222"/>
+          <w:sz w:val="21"/>
+        </w:rPr>
+        <w:t>外表冷酷叛逆，独来独往，实际上嘴硬心软、专一可靠，有强烈的责任感。母亲改嫁后，他随继父姓Whitmore，却始终觉得自己是这个家里的外来者。他拥有所有人羡慕的身份，却承受着家族期待和追逐梦想的压力。</w:t>
+      </w:r>
+    </w:p>
+    <w:p>
+      <w:pPr/>
+      <w:r>
+        <w:rPr>
+          <w:rFonts w:ascii="Arial Unicode MS" w:hAnsi="Arial Unicode MS" w:eastAsia="Arial Unicode MS"/>
+          <w:b w:val="0"/>
+          <w:i w:val="0"/>
+          <w:color w:val="222222"/>
+          <w:sz w:val="21"/>
+        </w:rPr>
+        <w:t>Ivy初入Whitmore家时，Ryder曾救过她，也一直默默关注这个看似柔弱却努力生活的女孩。一次意外与Ivy交换身体后，他第一次看到她经历的一切，也开始理解她的坚强。</w:t>
+      </w:r>
+    </w:p>
+    <w:p>
+      <w:pPr/>
+      <w:r>
+        <w:rPr>
+          <w:rFonts w:ascii="Arial Unicode MS" w:hAnsi="Arial Unicode MS" w:eastAsia="Arial Unicode MS"/>
+          <w:b w:val="0"/>
+          <w:i w:val="0"/>
+          <w:color w:val="222222"/>
+          <w:sz w:val="21"/>
+        </w:rPr>
+        <w:t>Ivy让他学会表达真实情绪，而Ryder则帮助Ivy找回自信。</w:t>
+      </w:r>
+    </w:p>
+    <w:p>
+      <w:pPr>
+        <w:pStyle w:val="Heading2"/>
+      </w:pPr>
+      <w:r>
+        <w:rPr>
+          <w:rFonts w:ascii="Arial Unicode MS" w:hAnsi="Arial Unicode MS" w:eastAsia="Arial Unicode MS"/>
+          <w:b/>
+          <w:i w:val="0"/>
+          <w:color w:val="A86543"/>
+          <w:sz w:val="30"/>
+        </w:rPr>
+        <w:t>Adrian Whitmore｜男二</w:t>
+      </w:r>
+    </w:p>
+    <w:p>
+      <w:pPr/>
+      <w:r>
+        <w:rPr>
+          <w:rFonts w:ascii="Arial Unicode MS" w:hAnsi="Arial Unicode MS" w:eastAsia="Arial Unicode MS"/>
+          <w:b w:val="0"/>
+          <w:i w:val="0"/>
+          <w:color w:val="222222"/>
+          <w:sz w:val="21"/>
+        </w:rPr>
+        <w:t>18岁，学生会主席、Whitmore家亲生继承人。金发英俊，举止优雅，是所有人眼中的完美贵公子。表面温柔体贴，实际阴暗偏执，控制欲极强。</w:t>
+      </w:r>
+    </w:p>
+    <w:p>
+      <w:pPr/>
+      <w:r>
+        <w:rPr>
+          <w:rFonts w:ascii="Arial Unicode MS" w:hAnsi="Arial Unicode MS" w:eastAsia="Arial Unicode MS"/>
+          <w:b w:val="0"/>
+          <w:i w:val="0"/>
+          <w:color w:val="222222"/>
+          <w:sz w:val="21"/>
+        </w:rPr>
+        <w:t>他确实喜欢Ivy，但他的爱更像占有。他享受Ivy崇拜自己、依赖自己，因此长期用温柔和暧昧控制她，让她成为自己最听话的助手。他嫉妒Ryder，因为这个继弟虽然没有Whitmore血统，却凭借冰球获得父亲关注、学校认可，甚至赢得Ivy真正的信任。</w:t>
+      </w:r>
+    </w:p>
+    <w:p>
+      <w:pPr>
+        <w:pStyle w:val="Heading2"/>
+      </w:pPr>
+      <w:r>
+        <w:rPr>
+          <w:rFonts w:ascii="Arial Unicode MS" w:hAnsi="Arial Unicode MS" w:eastAsia="Arial Unicode MS"/>
+          <w:b/>
+          <w:i w:val="0"/>
+          <w:color w:val="A86543"/>
+          <w:sz w:val="30"/>
+        </w:rPr>
+        <w:t>Vanessa Blake｜假闺蜜</w:t>
+      </w:r>
+    </w:p>
+    <w:p>
+      <w:pPr/>
+      <w:r>
+        <w:rPr>
+          <w:rFonts w:ascii="Arial Unicode MS" w:hAnsi="Arial Unicode MS" w:eastAsia="Arial Unicode MS"/>
+          <w:b w:val="0"/>
+          <w:i w:val="0"/>
+          <w:color w:val="222222"/>
+          <w:sz w:val="21"/>
+        </w:rPr>
+        <w:t>18岁，啦啦队员。金色卷发，外表甜美，是校园里的社交中心。表面热情友好，实际上虚荣嫉妒，擅长利用别人。</w:t>
+      </w:r>
+    </w:p>
+    <w:p>
+      <w:pPr/>
+      <w:r>
+        <w:rPr>
+          <w:rFonts w:ascii="Arial Unicode MS" w:hAnsi="Arial Unicode MS" w:eastAsia="Arial Unicode MS"/>
+          <w:b w:val="0"/>
+          <w:i w:val="0"/>
+          <w:color w:val="222222"/>
+          <w:sz w:val="21"/>
+        </w:rPr>
+        <w:t>她把Ivy当成免费的助手，让她替自己完成作业、处理琐事，同时嫉妒Ivy和Adrian之间的特殊关系。为了得到Adrian，她设计错误告白陷害Ivy。计划失败后，她联合Sienna不断制造流言，试图让Ivy重新回到被控制的位置。</w:t>
+      </w:r>
+    </w:p>
+    <w:p>
+      <w:pPr>
+        <w:pStyle w:val="Heading2"/>
+      </w:pPr>
+      <w:r>
+        <w:rPr>
+          <w:rFonts w:ascii="Arial Unicode MS" w:hAnsi="Arial Unicode MS" w:eastAsia="Arial Unicode MS"/>
+          <w:b/>
+          <w:i w:val="0"/>
+          <w:color w:val="A86543"/>
+          <w:sz w:val="30"/>
+        </w:rPr>
+        <w:t>Sienna Sterling｜反派</w:t>
+      </w:r>
+    </w:p>
+    <w:p>
+      <w:pPr/>
+      <w:r>
+        <w:rPr>
+          <w:rFonts w:ascii="Arial Unicode MS" w:hAnsi="Arial Unicode MS" w:eastAsia="Arial Unicode MS"/>
+          <w:b w:val="0"/>
+          <w:i w:val="0"/>
+          <w:color w:val="222222"/>
+          <w:sz w:val="21"/>
+        </w:rPr>
+        <w:t>18岁，校董女儿，校园社交女王。金色直发，高挑漂亮，永远穿着昂贵精致的服装。高傲、自信、占有欲极强。</w:t>
+      </w:r>
+    </w:p>
+    <w:p>
+      <w:pPr/>
+      <w:r>
+        <w:rPr>
+          <w:rFonts w:ascii="Arial Unicode MS" w:hAnsi="Arial Unicode MS" w:eastAsia="Arial Unicode MS"/>
+          <w:b w:val="0"/>
+          <w:i w:val="0"/>
+          <w:color w:val="222222"/>
+          <w:sz w:val="21"/>
+        </w:rPr>
+        <w:t>她把Ryder视为自己的专属战利品，而不是平等的恋人。作为Whitmore家默认的联姻对象，她无法接受Ryder选择Ivy。她认为Ivy夺走了属于自己的位置，因此联合Vanessa打压Ivy。她利用父亲的权力威胁Ryder的冰球事业，却低估了Ryder对自由和梦想的坚持。</w:t>
       </w:r>
     </w:p>
     <w:p>
@@ -115,11 +352,26 @@
     </w:p>
     <w:p>
       <w:pPr>
-        <w:pStyle w:val="Heading2"/>
+        <w:pStyle w:val="Heading1"/>
       </w:pPr>
       <w:r>
         <w:rPr>
-          <w:rFonts w:ascii="STSong" w:hAnsi="STSong" w:eastAsia="STSong"/>
+          <w:rFonts w:ascii="Arial Unicode MS" w:hAnsi="Arial Unicode MS" w:eastAsia="Arial Unicode MS"/>
+          <w:b/>
+          <w:i w:val="0"/>
+          <w:color w:val="222222"/>
+          <w:sz w:val="38"/>
+        </w:rPr>
+        <w:t>英文剧本｜EP1—EP3</w:t>
+      </w:r>
+    </w:p>
+    <w:p>
+      <w:pPr>
+        <w:pStyle w:val="Heading2"/>
+      </w:pPr>
+      <w:r>
+        <w:rPr>
+          <w:rFonts w:ascii="Arial Unicode MS" w:hAnsi="Arial Unicode MS" w:eastAsia="Arial Unicode MS"/>
           <w:b/>
           <w:i w:val="0"/>
           <w:color w:val="A86543"/>
@@ -134,7 +386,7 @@
       </w:pPr>
       <w:r>
         <w:rPr>
-          <w:rFonts w:ascii="STSong" w:hAnsi="STSong" w:eastAsia="STSong"/>
+          <w:rFonts w:ascii="Arial Unicode MS" w:hAnsi="Arial Unicode MS" w:eastAsia="Arial Unicode MS"/>
           <w:b/>
           <w:i w:val="0"/>
           <w:color w:val="222222"/>
@@ -150,61 +402,61 @@
       </w:pPr>
       <w:r>
         <w:rPr>
-          <w:rFonts w:ascii="STSong" w:hAnsi="STSong" w:eastAsia="STSong"/>
+          <w:rFonts w:ascii="Arial Unicode MS" w:hAnsi="Arial Unicode MS" w:eastAsia="Arial Unicode MS"/>
           <w:b/>
           <w:i w:val="0"/>
           <w:color w:val="222222"/>
           <w:sz w:val="21"/>
         </w:rPr>
-        <w:t>人物：Ivy、Ryder</w:t>
+        <w:t>人物: Ivy、Ryder</w:t>
       </w:r>
     </w:p>
     <w:p>
       <w:pPr>
         <w:spacing w:after="80"/>
-        <w:ind w:firstLine="0" w:left="227" w:right="113"/>
+        <w:ind w:left="227"/>
       </w:pPr>
       <w:r>
         <w:rPr>
-          <w:rFonts w:ascii="STSong" w:hAnsi="STSong" w:eastAsia="STSong"/>
+          <w:rFonts w:ascii="Arial Unicode MS" w:hAnsi="Arial Unicode MS" w:eastAsia="Arial Unicode MS"/>
           <w:b w:val="0"/>
           <w:i w:val="0"/>
           <w:color w:val="222222"/>
           <w:sz w:val="21"/>
         </w:rPr>
-        <w:t>△学生会会长专属休息室内一片昏暗，只有浴室门帘缝透出一线光。</w:t>
+        <w:t>▲ 学生会会长专属休息室内一片昏暗,只有浴室门帘缝透出一线光。</w:t>
       </w:r>
     </w:p>
     <w:p>
       <w:pPr>
         <w:spacing w:after="80"/>
-        <w:ind w:firstLine="0" w:left="227" w:right="113"/>
+        <w:ind w:left="227"/>
       </w:pPr>
       <w:r>
         <w:rPr>
-          <w:rFonts w:ascii="STSong" w:hAnsi="STSong" w:eastAsia="STSong"/>
+          <w:rFonts w:ascii="Arial Unicode MS" w:hAnsi="Arial Unicode MS" w:eastAsia="Arial Unicode MS"/>
           <w:b w:val="0"/>
           <w:i w:val="0"/>
           <w:color w:val="222222"/>
           <w:sz w:val="21"/>
         </w:rPr>
-        <w:t>△浴室浴帘内，一个男人正在洗澡，光线勾勒出男人身材优越的背影。</w:t>
+        <w:t>▲ 浴室浴帘内,一个男人正在洗澡,光线勾勒出男人身材优越的背影。</w:t>
       </w:r>
     </w:p>
     <w:p>
       <w:pPr>
         <w:spacing w:after="80"/>
-        <w:ind w:firstLine="0" w:left="227" w:right="113"/>
+        <w:ind w:left="227"/>
       </w:pPr>
       <w:r>
         <w:rPr>
-          <w:rFonts w:ascii="STSong" w:hAnsi="STSong" w:eastAsia="STSong"/>
+          <w:rFonts w:ascii="Arial Unicode MS" w:hAnsi="Arial Unicode MS" w:eastAsia="Arial Unicode MS"/>
           <w:b w:val="0"/>
           <w:i w:val="0"/>
           <w:color w:val="222222"/>
           <w:sz w:val="21"/>
         </w:rPr>
-        <w:t>△Ivy瞪大眼睛看着浴室中男人的背影，咽了咽口水。</w:t>
+        <w:t>▲ Ivy 瞪大眼睛盯着浴室中男人的背影,脸颊微红,咽了咽口水。</w:t>
       </w:r>
     </w:p>
     <w:p>
@@ -214,29 +466,29 @@
       </w:pPr>
       <w:r>
         <w:rPr>
-          <w:rFonts w:ascii="STSong" w:hAnsi="STSong" w:eastAsia="STSong"/>
+          <w:rFonts w:ascii="Arial Unicode MS" w:hAnsi="Arial Unicode MS" w:eastAsia="Arial Unicode MS"/>
           <w:b/>
           <w:i w:val="0"/>
           <w:color w:val="222222"/>
           <w:sz w:val="21"/>
         </w:rPr>
-        <w:t>Ivy （os）：Adrian，他在洗澡？</w:t>
+        <w:t>Ivy (OS): Adrian... he's in the shower?</w:t>
       </w:r>
     </w:p>
     <w:p>
       <w:pPr>
         <w:spacing w:after="80"/>
-        <w:ind w:firstLine="0" w:left="227" w:right="113"/>
+        <w:ind w:left="227"/>
       </w:pPr>
       <w:r>
         <w:rPr>
-          <w:rFonts w:ascii="STSong" w:hAnsi="STSong" w:eastAsia="STSong"/>
+          <w:rFonts w:ascii="Arial Unicode MS" w:hAnsi="Arial Unicode MS" w:eastAsia="Arial Unicode MS"/>
           <w:b w:val="0"/>
           <w:i w:val="0"/>
           <w:color w:val="222222"/>
           <w:sz w:val="21"/>
         </w:rPr>
-        <w:t>△Ivy害羞低下头，神色紧张，攥紧了手中的告白信。</w:t>
+        <w:t>▲ Ivy 害羞地低下头,神色紧张,手心冒汗地攥紧了那枚避孕套。</w:t>
       </w:r>
     </w:p>
     <w:p>
@@ -246,13 +498,13 @@
       </w:pPr>
       <w:r>
         <w:rPr>
-          <w:rFonts w:ascii="STSong" w:hAnsi="STSong" w:eastAsia="STSong"/>
+          <w:rFonts w:ascii="Arial Unicode MS" w:hAnsi="Arial Unicode MS" w:eastAsia="Arial Unicode MS"/>
           <w:b/>
           <w:i w:val="0"/>
           <w:color w:val="222222"/>
           <w:sz w:val="21"/>
         </w:rPr>
-        <w:t>Ivy （os）：他会答应我的告白吗，他说过成年后就重新考虑我们的关系。</w:t>
+        <w:t>Ivy (OS): Will he actually say yes? He promised... Once we turned eighteen, he'd give us a real shot.</w:t>
       </w:r>
     </w:p>
     <w:p>
@@ -262,45 +514,45 @@
       </w:pPr>
       <w:r>
         <w:rPr>
-          <w:rFonts w:ascii="STSong" w:hAnsi="STSong" w:eastAsia="STSong"/>
+          <w:rFonts w:ascii="Arial Unicode MS" w:hAnsi="Arial Unicode MS" w:eastAsia="Arial Unicode MS"/>
           <w:b/>
           <w:i w:val="0"/>
           <w:color w:val="222222"/>
           <w:sz w:val="21"/>
         </w:rPr>
-        <w:t>Ivy：（抬头看向浴帘）Adrian？</w:t>
+        <w:t>Ivy: (抬头看向浴帘,声音发颤) Adrian?</w:t>
       </w:r>
     </w:p>
     <w:p>
       <w:pPr>
         <w:spacing w:after="80"/>
-        <w:ind w:firstLine="0" w:left="227" w:right="113"/>
+        <w:ind w:left="227"/>
       </w:pPr>
       <w:r>
         <w:rPr>
-          <w:rFonts w:ascii="STSong" w:hAnsi="STSong" w:eastAsia="STSong"/>
+          <w:rFonts w:ascii="Arial Unicode MS" w:hAnsi="Arial Unicode MS" w:eastAsia="Arial Unicode MS"/>
           <w:b w:val="0"/>
           <w:i w:val="0"/>
           <w:color w:val="222222"/>
           <w:sz w:val="21"/>
         </w:rPr>
-        <w:t>△ 浴室内男人的动作顿了一下，却没有回应Ivy，继续洗澡。</w:t>
+        <w:t>▲ 浴室内男人的动作顿了一下,却没有回应 Ivy,继续洗澡。</w:t>
       </w:r>
     </w:p>
     <w:p>
       <w:pPr>
         <w:spacing w:after="80"/>
-        <w:ind w:firstLine="0" w:left="227" w:right="113"/>
+        <w:ind w:left="227"/>
       </w:pPr>
       <w:r>
         <w:rPr>
-          <w:rFonts w:ascii="STSong" w:hAnsi="STSong" w:eastAsia="STSong"/>
+          <w:rFonts w:ascii="Arial Unicode MS" w:hAnsi="Arial Unicode MS" w:eastAsia="Arial Unicode MS"/>
           <w:b w:val="0"/>
           <w:i w:val="0"/>
           <w:color w:val="222222"/>
           <w:sz w:val="21"/>
         </w:rPr>
-        <w:t>△ Ivy慢慢靠近，咽了咽口水，手里紧紧攥着准备好的避孕套。</w:t>
+        <w:t>▲ Ivy 深吸一口气,慢慢靠近,手里紧紧攥着准备好的避孕套。</w:t>
       </w:r>
     </w:p>
     <w:p>
@@ -310,29 +562,29 @@
       </w:pPr>
       <w:r>
         <w:rPr>
-          <w:rFonts w:ascii="STSong" w:hAnsi="STSong" w:eastAsia="STSong"/>
+          <w:rFonts w:ascii="Arial Unicode MS" w:hAnsi="Arial Unicode MS" w:eastAsia="Arial Unicode MS"/>
           <w:b/>
           <w:i w:val="0"/>
           <w:color w:val="222222"/>
           <w:sz w:val="21"/>
         </w:rPr>
-        <w:t>Ivy：（深吸一口气）Adrian你知道的，我喜欢你很久了。</w:t>
+        <w:t>Ivy: (深吸一口气,声音微颤) Adrian... You know I've been into you for the longest time.</w:t>
       </w:r>
     </w:p>
     <w:p>
       <w:pPr>
         <w:spacing w:after="80"/>
-        <w:ind w:firstLine="0" w:left="227" w:right="113"/>
+        <w:ind w:left="227"/>
       </w:pPr>
       <w:r>
         <w:rPr>
-          <w:rFonts w:ascii="STSong" w:hAnsi="STSong" w:eastAsia="STSong"/>
+          <w:rFonts w:ascii="Arial Unicode MS" w:hAnsi="Arial Unicode MS" w:eastAsia="Arial Unicode MS"/>
           <w:b w:val="0"/>
           <w:i w:val="0"/>
           <w:color w:val="222222"/>
           <w:sz w:val="21"/>
         </w:rPr>
-        <w:t>△ Ivy走到浴帘前，神色紧张、眉头紧皱、咬着嘴唇。</w:t>
+        <w:t>▲ Ivy 走到浴帘前,神色紧张、眉头紧皱、咬着嘴唇,心跳快得像要跳出胸腔。</w:t>
       </w:r>
     </w:p>
     <w:p>
@@ -342,93 +594,93 @@
       </w:pPr>
       <w:r>
         <w:rPr>
-          <w:rFonts w:ascii="STSong" w:hAnsi="STSong" w:eastAsia="STSong"/>
+          <w:rFonts w:ascii="Arial Unicode MS" w:hAnsi="Arial Unicode MS" w:eastAsia="Arial Unicode MS"/>
           <w:b/>
           <w:i w:val="0"/>
           <w:color w:val="222222"/>
           <w:sz w:val="21"/>
         </w:rPr>
-        <w:t>Ivy：（停顿）Mr. Whitmore，我想勇敢一次，今晚……我任你处置。</w:t>
+        <w:t>Ivy: (停顿) Mr. Whitmore... Tonight... do whatever you want with me.</w:t>
       </w:r>
     </w:p>
     <w:p>
       <w:pPr>
         <w:spacing w:after="80"/>
-        <w:ind w:firstLine="0" w:left="227" w:right="113"/>
+        <w:ind w:left="227"/>
       </w:pPr>
       <w:r>
         <w:rPr>
-          <w:rFonts w:ascii="STSong" w:hAnsi="STSong" w:eastAsia="STSong"/>
+          <w:rFonts w:ascii="Arial Unicode MS" w:hAnsi="Arial Unicode MS" w:eastAsia="Arial Unicode MS"/>
           <w:b w:val="0"/>
           <w:i w:val="0"/>
           <w:color w:val="222222"/>
           <w:sz w:val="21"/>
         </w:rPr>
-        <w:t>△ 浴室中的的男人微微拉开浴帘，即将走出来。</w:t>
+        <w:t>▲ 浴室中的男人正要拉开浴帘,即将走出来。</w:t>
       </w:r>
     </w:p>
     <w:p>
       <w:pPr>
         <w:spacing w:after="80"/>
-        <w:ind w:firstLine="0" w:left="227" w:right="113"/>
+        <w:ind w:left="227"/>
       </w:pPr>
       <w:r>
         <w:rPr>
-          <w:rFonts w:ascii="STSong" w:hAnsi="STSong" w:eastAsia="STSong"/>
+          <w:rFonts w:ascii="Arial Unicode MS" w:hAnsi="Arial Unicode MS" w:eastAsia="Arial Unicode MS"/>
           <w:b w:val="0"/>
           <w:i w:val="0"/>
           <w:color w:val="222222"/>
           <w:sz w:val="21"/>
         </w:rPr>
-        <w:t>△ Ivy紧张地闭上眼睛，踮起脚尖，朝着男人吻了过去。</w:t>
+        <w:t>▲ Ivy 紧张地闭上眼睛,踮起脚尖,朝着男人吻了过去。</w:t>
       </w:r>
     </w:p>
     <w:p>
       <w:pPr>
         <w:spacing w:after="80"/>
-        <w:ind w:firstLine="0" w:left="227" w:right="113"/>
+        <w:ind w:left="227"/>
       </w:pPr>
       <w:r>
         <w:rPr>
-          <w:rFonts w:ascii="STSong" w:hAnsi="STSong" w:eastAsia="STSong"/>
+          <w:rFonts w:ascii="Arial Unicode MS" w:hAnsi="Arial Unicode MS" w:eastAsia="Arial Unicode MS"/>
           <w:b w:val="0"/>
           <w:i w:val="0"/>
           <w:color w:val="222222"/>
           <w:sz w:val="21"/>
         </w:rPr>
-        <w:t>△ 男生猛地拉开浴帘，转身的一瞬间，与Ivy撞在一起，两人的双唇碰在一起。</w:t>
+        <w:t>▲ 男生猛地拉开浴帘，转身的一瞬间，与 Ivy 撞在一起,两人的双唇意外贴合。</w:t>
       </w:r>
     </w:p>
     <w:p>
       <w:pPr>
         <w:spacing w:after="80"/>
-        <w:ind w:firstLine="0" w:left="227" w:right="113"/>
+        <w:ind w:left="227"/>
       </w:pPr>
       <w:r>
         <w:rPr>
-          <w:rFonts w:ascii="STSong" w:hAnsi="STSong" w:eastAsia="STSong"/>
+          <w:rFonts w:ascii="Arial Unicode MS" w:hAnsi="Arial Unicode MS" w:eastAsia="Arial Unicode MS"/>
           <w:b w:val="0"/>
           <w:i w:val="0"/>
           <w:color w:val="222222"/>
           <w:sz w:val="21"/>
         </w:rPr>
-        <w:t>△ Ryder看着眼前的Ivy，一惊，准备推开Ivy。</w:t>
+        <w:t>▲ Ryder 看着眼前的 Ivy,瞳孔一缩,本能地想推开她。</w:t>
       </w:r>
     </w:p>
     <w:p>
       <w:pPr>
         <w:spacing w:after="80"/>
-        <w:ind w:firstLine="0" w:left="227" w:right="113"/>
+        <w:ind w:left="227"/>
       </w:pPr>
       <w:r>
         <w:rPr>
-          <w:rFonts w:ascii="STSong" w:hAnsi="STSong" w:eastAsia="STSong"/>
+          <w:rFonts w:ascii="Arial Unicode MS" w:hAnsi="Arial Unicode MS" w:eastAsia="Arial Unicode MS"/>
           <w:b w:val="0"/>
           <w:i w:val="0"/>
           <w:color w:val="222222"/>
           <w:sz w:val="21"/>
         </w:rPr>
-        <w:t>△ Ivy沉浸在这个吻中，闭紧眼睛，想要继续深吻下去。</w:t>
+        <w:t>▲ Ivy 沉浸在这个吻中,闭紧眼睛,甚至主动想要继续深吻下去。</w:t>
       </w:r>
     </w:p>
     <w:p>
@@ -438,29 +690,29 @@
       </w:pPr>
       <w:r>
         <w:rPr>
-          <w:rFonts w:ascii="STSong" w:hAnsi="STSong" w:eastAsia="STSong"/>
+          <w:rFonts w:ascii="Arial Unicode MS" w:hAnsi="Arial Unicode MS" w:eastAsia="Arial Unicode MS"/>
           <w:b/>
           <w:i w:val="0"/>
           <w:color w:val="222222"/>
           <w:sz w:val="21"/>
         </w:rPr>
-        <w:t>Ryder：Ivy？</w:t>
+        <w:t>Ryder: (闷声) Ivy?</w:t>
       </w:r>
     </w:p>
     <w:p>
       <w:pPr>
         <w:spacing w:after="80"/>
-        <w:ind w:firstLine="0" w:left="227" w:right="113"/>
+        <w:ind w:left="227"/>
       </w:pPr>
       <w:r>
         <w:rPr>
-          <w:rFonts w:ascii="STSong" w:hAnsi="STSong" w:eastAsia="STSong"/>
+          <w:rFonts w:ascii="Arial Unicode MS" w:hAnsi="Arial Unicode MS" w:eastAsia="Arial Unicode MS"/>
           <w:b w:val="0"/>
           <w:i w:val="0"/>
           <w:color w:val="222222"/>
           <w:sz w:val="21"/>
         </w:rPr>
-        <w:t>△ Ivy睁开眼，看清眼前的人，表情震惊又愤怒。</w:t>
+        <w:t>▲ Ivy 猛地睁开眼,看清眼前的人,表情从期待瞬间变成震惊又愤怒。</w:t>
       </w:r>
     </w:p>
     <w:p>
@@ -470,13 +722,13 @@
       </w:pPr>
       <w:r>
         <w:rPr>
-          <w:rFonts w:ascii="STSong" w:hAnsi="STSong" w:eastAsia="STSong"/>
+          <w:rFonts w:ascii="Arial Unicode MS" w:hAnsi="Arial Unicode MS" w:eastAsia="Arial Unicode MS"/>
           <w:b/>
           <w:i w:val="0"/>
           <w:color w:val="222222"/>
           <w:sz w:val="21"/>
         </w:rPr>
-        <w:t>Ivy：Ryder，是你？</w:t>
+        <w:t>Ivy: (尖叫) Ryder?! It's YOU?!</w:t>
       </w:r>
     </w:p>
     <w:p>
@@ -486,13 +738,13 @@
       </w:pPr>
       <w:r>
         <w:rPr>
-          <w:rFonts w:ascii="STSong" w:hAnsi="STSong" w:eastAsia="STSong"/>
+          <w:rFonts w:ascii="Arial Unicode MS" w:hAnsi="Arial Unicode MS" w:eastAsia="Arial Unicode MS"/>
           <w:b/>
           <w:i w:val="0"/>
           <w:color w:val="222222"/>
           <w:sz w:val="21"/>
         </w:rPr>
-        <w:t>Ryder：（轻笑一声）你刚刚说，今晚任我处置？</w:t>
+        <w:t>Ryder: (轻笑一声) You just said... tonight I can do whatever I want with you?</w:t>
       </w:r>
     </w:p>
     <w:p>
@@ -502,70 +754,118 @@
       </w:pPr>
       <w:r>
         <w:rPr>
-          <w:rFonts w:ascii="STSong" w:hAnsi="STSong" w:eastAsia="STSong"/>
+          <w:rFonts w:ascii="Arial Unicode MS" w:hAnsi="Arial Unicode MS" w:eastAsia="Arial Unicode MS"/>
           <w:b/>
           <w:i w:val="0"/>
           <w:color w:val="222222"/>
           <w:sz w:val="21"/>
         </w:rPr>
-        <w:t>Ivy：滚开。</w:t>
+        <w:t>Ivy: (脸涨红) Get the HELL off me!</w:t>
       </w:r>
     </w:p>
     <w:p>
       <w:pPr>
         <w:spacing w:after="80"/>
-        <w:ind w:firstLine="0" w:left="227" w:right="113"/>
+        <w:ind w:left="227"/>
       </w:pPr>
       <w:r>
         <w:rPr>
-          <w:rFonts w:ascii="STSong" w:hAnsi="STSong" w:eastAsia="STSong"/>
+          <w:rFonts w:ascii="Arial Unicode MS" w:hAnsi="Arial Unicode MS" w:eastAsia="Arial Unicode MS"/>
           <w:b w:val="0"/>
           <w:i w:val="0"/>
           <w:color w:val="222222"/>
           <w:sz w:val="21"/>
         </w:rPr>
-        <w:t>△ Ivy刚要伸手推开Ryder，但脚下一滑，正要摔倒，Ryder下意识拉她，但脚下也滑，导致Ryder被Ivy带着一起摔倒在地，摔地之前，Ryder用手垫在了Ivy的头下，但使得两人额头狠狠撞在一起，嘴唇再次贴合亲吻。两人惊讶。</w:t>
+        <w:t>▲ Ivy 刚要伸手推开 Ryder,但脚下一滑,身体失衡向后倒去,</w:t>
       </w:r>
     </w:p>
     <w:p>
       <w:pPr>
         <w:spacing w:after="80"/>
-        <w:ind w:firstLine="0" w:left="227" w:right="113"/>
+        <w:ind w:left="227"/>
       </w:pPr>
       <w:r>
         <w:rPr>
-          <w:rFonts w:ascii="STSong" w:hAnsi="STSong" w:eastAsia="STSong"/>
+          <w:rFonts w:ascii="Arial Unicode MS" w:hAnsi="Arial Unicode MS" w:eastAsia="Arial Unicode MS"/>
           <w:b w:val="0"/>
           <w:i w:val="0"/>
           <w:color w:val="222222"/>
           <w:sz w:val="21"/>
         </w:rPr>
-        <w:t>△ 此时休息室的灯光突然疯狂闪烁，一阵诡异的声音响起。</w:t>
+        <w:t>▲ Ryder 下意识伸手拉她,但被Ivy拽倒在地。。</w:t>
       </w:r>
     </w:p>
     <w:p>
       <w:pPr>
         <w:spacing w:after="80"/>
-        <w:ind w:firstLine="0" w:left="227" w:right="113"/>
+        <w:ind w:left="227"/>
       </w:pPr>
       <w:r>
         <w:rPr>
-          <w:rFonts w:ascii="STSong" w:hAnsi="STSong" w:eastAsia="STSong"/>
+          <w:rFonts w:ascii="Arial Unicode MS" w:hAnsi="Arial Unicode MS" w:eastAsia="Arial Unicode MS"/>
           <w:b w:val="0"/>
           <w:i w:val="0"/>
           <w:color w:val="222222"/>
           <w:sz w:val="21"/>
         </w:rPr>
-        <w:t>△ 两人撞晕，失去意识。</w:t>
+        <w:t>▲ 摔地之前,Ryder 本能地伸手护住 Ivy 的后脑勺,两人靠的很近，额头狠狠撞在一起,嘴唇再次贴合亲吻。</w:t>
       </w:r>
     </w:p>
     <w:p>
       <w:pPr>
-        <w:pStyle w:val="Heading3"/>
+        <w:spacing w:after="80"/>
+        <w:ind w:left="227"/>
       </w:pPr>
       <w:r>
         <w:rPr>
-          <w:rFonts w:ascii="STSong" w:hAnsi="STSong" w:eastAsia="STSong"/>
+          <w:rFonts w:ascii="Arial Unicode MS" w:hAnsi="Arial Unicode MS" w:eastAsia="Arial Unicode MS"/>
+          <w:b w:val="0"/>
+          <w:i w:val="0"/>
+          <w:color w:val="222222"/>
+          <w:sz w:val="21"/>
+        </w:rPr>
+        <w:t>▲ 两人同时耳鸣，瞳孔放大,表情惊骇。</w:t>
+      </w:r>
+    </w:p>
+    <w:p>
+      <w:pPr>
+        <w:spacing w:after="80"/>
+        <w:ind w:left="227"/>
+      </w:pPr>
+      <w:r>
+        <w:rPr>
+          <w:rFonts w:ascii="Arial Unicode MS" w:hAnsi="Arial Unicode MS" w:eastAsia="Arial Unicode MS"/>
+          <w:b w:val="0"/>
+          <w:i w:val="0"/>
+          <w:color w:val="222222"/>
+          <w:sz w:val="21"/>
+        </w:rPr>
+        <w:t>▲ 此时休息室的灯光突然疯狂闪烁,一阵诡异的电流声"滋滋滋"响起。</w:t>
+      </w:r>
+    </w:p>
+    <w:p>
+      <w:pPr>
+        <w:spacing w:after="80"/>
+        <w:ind w:left="227"/>
+      </w:pPr>
+      <w:r>
+        <w:rPr>
+          <w:rFonts w:ascii="Arial Unicode MS" w:hAnsi="Arial Unicode MS" w:eastAsia="Arial Unicode MS"/>
+          <w:b w:val="0"/>
+          <w:i w:val="0"/>
+          <w:color w:val="222222"/>
+          <w:sz w:val="21"/>
+        </w:rPr>
+        <w:t>▲ 两人失去意识。</w:t>
+      </w:r>
+    </w:p>
+    <w:p>
+      <w:pPr>
+        <w:pStyle w:val="Heading3"/>
+      </w:pPr>
+      <w:r>
+        <w:rPr>
+          <w:rFonts w:ascii="Arial Unicode MS" w:hAnsi="Arial Unicode MS" w:eastAsia="Arial Unicode MS"/>
           <w:b/>
           <w:i w:val="0"/>
           <w:color w:val="222222"/>
@@ -581,45 +881,45 @@
       </w:pPr>
       <w:r>
         <w:rPr>
-          <w:rFonts w:ascii="STSong" w:hAnsi="STSong" w:eastAsia="STSong"/>
+          <w:rFonts w:ascii="Arial Unicode MS" w:hAnsi="Arial Unicode MS" w:eastAsia="Arial Unicode MS"/>
           <w:b/>
           <w:i w:val="0"/>
           <w:color w:val="222222"/>
           <w:sz w:val="21"/>
         </w:rPr>
-        <w:t>人物：Ivy（外貌Ryder）、Ryder（外貌Ivy）</w:t>
+        <w:t>人物: Ivy (in Ryder's body)、Ryder (in Ivy's body)</w:t>
       </w:r>
     </w:p>
     <w:p>
       <w:pPr>
         <w:spacing w:after="80"/>
-        <w:ind w:firstLine="0" w:left="227" w:right="113"/>
+        <w:ind w:left="227"/>
       </w:pPr>
       <w:r>
         <w:rPr>
-          <w:rFonts w:ascii="STSong" w:hAnsi="STSong" w:eastAsia="STSong"/>
+          <w:rFonts w:ascii="Arial Unicode MS" w:hAnsi="Arial Unicode MS" w:eastAsia="Arial Unicode MS"/>
           <w:b w:val="0"/>
           <w:i w:val="0"/>
           <w:color w:val="222222"/>
           <w:sz w:val="21"/>
         </w:rPr>
-        <w:t>△ Ivy（外貌Ryder） 睁开眼，挠了挠头，艰难地撑起身。</w:t>
+        <w:t>▲ Ivy (in Ryder's body) 缓缓睁开眼,挠了挠头,艰难地撑起身体。</w:t>
       </w:r>
     </w:p>
     <w:p>
       <w:pPr>
         <w:spacing w:after="80"/>
-        <w:ind w:firstLine="0" w:left="227" w:right="113"/>
+        <w:ind w:left="227"/>
       </w:pPr>
       <w:r>
         <w:rPr>
-          <w:rFonts w:ascii="STSong" w:hAnsi="STSong" w:eastAsia="STSong"/>
+          <w:rFonts w:ascii="Arial Unicode MS" w:hAnsi="Arial Unicode MS" w:eastAsia="Arial Unicode MS"/>
           <w:b w:val="0"/>
           <w:i w:val="0"/>
           <w:color w:val="222222"/>
           <w:sz w:val="21"/>
         </w:rPr>
-        <w:t>△ Ivy（外貌Ryder） 看见不远处“Ivy”的身体正坐在地上，手胸口上摸来摸去。</w:t>
+        <w:t>▲ Ivy (in Ryder's body) 看见不远处"Ivy"的身体正坐在地上,双手在胸口上摸来摸去。</w:t>
       </w:r>
     </w:p>
     <w:p>
@@ -629,77 +929,77 @@
       </w:pPr>
       <w:r>
         <w:rPr>
-          <w:rFonts w:ascii="STSong" w:hAnsi="STSong" w:eastAsia="STSong"/>
+          <w:rFonts w:ascii="Arial Unicode MS" w:hAnsi="Arial Unicode MS" w:eastAsia="Arial Unicode MS"/>
           <w:b/>
           <w:i w:val="0"/>
           <w:color w:val="222222"/>
           <w:sz w:val="21"/>
         </w:rPr>
-        <w:t>Ivy：（疑惑震惊）为什么那个人长的这么像我？！</w:t>
+        <w:t>Ivy: (疑惑震惊) Wait—why does that person look EXACTLY like me?!</w:t>
       </w:r>
     </w:p>
     <w:p>
       <w:pPr>
         <w:spacing w:after="80"/>
-        <w:ind w:firstLine="0" w:left="227" w:right="113"/>
+        <w:ind w:left="227"/>
       </w:pPr>
       <w:r>
         <w:rPr>
-          <w:rFonts w:ascii="STSong" w:hAnsi="STSong" w:eastAsia="STSong"/>
+          <w:rFonts w:ascii="Arial Unicode MS" w:hAnsi="Arial Unicode MS" w:eastAsia="Arial Unicode MS"/>
           <w:b w:val="0"/>
           <w:i w:val="0"/>
           <w:color w:val="222222"/>
           <w:sz w:val="21"/>
         </w:rPr>
-        <w:t>△ Ivy（外貌Ryder）低头看看自己伸出的双手，双手宽厚，双臂粗壮。</w:t>
+        <w:t>▲ Ivy (in Ryder's body) 低头看看自己伸出的双手——宽厚粗糙,手指修长,双臂粗壮结实。</w:t>
       </w:r>
     </w:p>
     <w:p>
       <w:pPr>
         <w:spacing w:after="80"/>
-        <w:ind w:firstLine="0" w:left="227" w:right="113"/>
+        <w:ind w:left="227"/>
       </w:pPr>
       <w:r>
         <w:rPr>
-          <w:rFonts w:ascii="STSong" w:hAnsi="STSong" w:eastAsia="STSong"/>
+          <w:rFonts w:ascii="Arial Unicode MS" w:hAnsi="Arial Unicode MS" w:eastAsia="Arial Unicode MS"/>
           <w:b w:val="0"/>
           <w:i w:val="0"/>
           <w:color w:val="222222"/>
           <w:sz w:val="21"/>
         </w:rPr>
-        <w:t>△ Ivy（外貌Ryder）急匆匆地冲到穿衣镜前。</w:t>
+        <w:t>▲ Ivy (in Ryder's body) 急匆匆地冲到穿衣镜前。</w:t>
       </w:r>
     </w:p>
     <w:p>
       <w:pPr>
         <w:spacing w:after="80"/>
-        <w:ind w:firstLine="0" w:left="227" w:right="113"/>
+        <w:ind w:left="227"/>
       </w:pPr>
       <w:r>
         <w:rPr>
-          <w:rFonts w:ascii="STSong" w:hAnsi="STSong" w:eastAsia="STSong"/>
+          <w:rFonts w:ascii="Arial Unicode MS" w:hAnsi="Arial Unicode MS" w:eastAsia="Arial Unicode MS"/>
           <w:b w:val="0"/>
           <w:i w:val="0"/>
           <w:color w:val="222222"/>
           <w:sz w:val="21"/>
         </w:rPr>
-        <w:t>△ 镜子照出Ryder 的脸，身上只围了一条浴巾的身体。</w:t>
+        <w:t>▲ 镜子照出 Ryder 的脸——棱角分明的下颌,深邃的眉眼,身上只围了一条浴巾,露出肌肉线条分明的身体。</w:t>
       </w:r>
     </w:p>
     <w:p>
       <w:pPr>
         <w:spacing w:after="80"/>
-        <w:ind w:firstLine="0" w:left="227" w:right="113"/>
+        <w:ind w:left="227"/>
       </w:pPr>
       <w:r>
         <w:rPr>
-          <w:rFonts w:ascii="STSong" w:hAnsi="STSong" w:eastAsia="STSong"/>
+          <w:rFonts w:ascii="Arial Unicode MS" w:hAnsi="Arial Unicode MS" w:eastAsia="Arial Unicode MS"/>
           <w:b w:val="0"/>
           <w:i w:val="0"/>
           <w:color w:val="222222"/>
           <w:sz w:val="21"/>
         </w:rPr>
-        <w:t>△ Ivy（外貌Ryder）做出几个表情，镜子中的Ryder也做出同样的表情。</w:t>
+        <w:t>▲ Ivy (in Ryder's body) 做出几个表情,镜子中的 Ryder 也做出同样的表情——张大嘴、瞪眼、摸脸。</w:t>
       </w:r>
     </w:p>
     <w:p>
@@ -709,29 +1009,29 @@
       </w:pPr>
       <w:r>
         <w:rPr>
-          <w:rFonts w:ascii="STSong" w:hAnsi="STSong" w:eastAsia="STSong"/>
+          <w:rFonts w:ascii="Arial Unicode MS" w:hAnsi="Arial Unicode MS" w:eastAsia="Arial Unicode MS"/>
           <w:b/>
           <w:i w:val="0"/>
           <w:color w:val="222222"/>
           <w:sz w:val="21"/>
         </w:rPr>
-        <w:t>Ivy（外貌Ryder）：这是？啊啊啊啊！鬼啊！我怎么变成了Ryder？！</w:t>
+        <w:t>Ivy (in Ryder's body): (尖叫) This is—AHHHHHHH! Oh my GOD! Why the hell did I turn into Ryder?!</w:t>
       </w:r>
     </w:p>
     <w:p>
       <w:pPr>
         <w:spacing w:after="80"/>
-        <w:ind w:firstLine="0" w:left="227" w:right="113"/>
+        <w:ind w:left="227"/>
       </w:pPr>
       <w:r>
         <w:rPr>
-          <w:rFonts w:ascii="STSong" w:hAnsi="STSong" w:eastAsia="STSong"/>
+          <w:rFonts w:ascii="Arial Unicode MS" w:hAnsi="Arial Unicode MS" w:eastAsia="Arial Unicode MS"/>
           <w:b w:val="0"/>
           <w:i w:val="0"/>
           <w:color w:val="222222"/>
           <w:sz w:val="21"/>
         </w:rPr>
-        <w:t>△Ivy（外貌Ryder）听见自己发出一道低沉陌生的男声，她瞬间僵在原地。</w:t>
+        <w:t>▲ Ivy (in Ryder's body) 听见自己发出一道低沉陌生的男声,她瞬间捂住嘴，僵在原地,表情惊恐。</w:t>
       </w:r>
     </w:p>
     <w:p>
@@ -741,29 +1041,29 @@
       </w:pPr>
       <w:r>
         <w:rPr>
-          <w:rFonts w:ascii="STSong" w:hAnsi="STSong" w:eastAsia="STSong"/>
+          <w:rFonts w:ascii="Arial Unicode MS" w:hAnsi="Arial Unicode MS" w:eastAsia="Arial Unicode MS"/>
           <w:b/>
           <w:i w:val="0"/>
           <w:color w:val="222222"/>
           <w:sz w:val="21"/>
         </w:rPr>
-        <w:t>Ryder（外貌Ivy）：（嫌弃地捂住耳朵）拜托，别用我的嗓子发出这种恶心的声音。</w:t>
+        <w:t>Ryder (in Ivy's body): (嫌弃地捂住耳朵) Ugh, please. Stop making that obnoxious noise with MY voice.</w:t>
       </w:r>
     </w:p>
     <w:p>
       <w:pPr>
         <w:spacing w:after="80"/>
-        <w:ind w:firstLine="0" w:left="227" w:right="113"/>
+        <w:ind w:left="227"/>
       </w:pPr>
       <w:r>
         <w:rPr>
-          <w:rFonts w:ascii="STSong" w:hAnsi="STSong" w:eastAsia="STSong"/>
+          <w:rFonts w:ascii="Arial Unicode MS" w:hAnsi="Arial Unicode MS" w:eastAsia="Arial Unicode MS"/>
           <w:b w:val="0"/>
           <w:i w:val="0"/>
           <w:color w:val="222222"/>
           <w:sz w:val="21"/>
         </w:rPr>
-        <w:t>△Ivy（外貌Ryder）转头看向Ryder（外貌Ivy），震惊地询问他。</w:t>
+        <w:t>▲ Ivy (in Ryder's body) 猛地转头看向 Ryder (in Ivy's body),震惊地指着他。</w:t>
       </w:r>
     </w:p>
     <w:p>
@@ -773,13 +1073,13 @@
       </w:pPr>
       <w:r>
         <w:rPr>
-          <w:rFonts w:ascii="STSong" w:hAnsi="STSong" w:eastAsia="STSong"/>
+          <w:rFonts w:ascii="Arial Unicode MS" w:hAnsi="Arial Unicode MS" w:eastAsia="Arial Unicode MS"/>
           <w:b/>
           <w:i w:val="0"/>
           <w:color w:val="222222"/>
           <w:sz w:val="21"/>
         </w:rPr>
-        <w:t>Ivy（外貌Ryder）：你？我？ 我们怎么？？</w:t>
+        <w:t>Ivy (in Ryder's body): You—me—WHAT THE FUCK?!</w:t>
       </w:r>
     </w:p>
     <w:p>
@@ -789,29 +1089,29 @@
       </w:pPr>
       <w:r>
         <w:rPr>
-          <w:rFonts w:ascii="STSong" w:hAnsi="STSong" w:eastAsia="STSong"/>
+          <w:rFonts w:ascii="Arial Unicode MS" w:hAnsi="Arial Unicode MS" w:eastAsia="Arial Unicode MS"/>
           <w:b/>
           <w:i w:val="0"/>
           <w:color w:val="222222"/>
           <w:sz w:val="21"/>
         </w:rPr>
-        <w:t>Ryder（外貌Ivy）：（摊摊手）不知道为什么，我们灵魂互换了？</w:t>
+        <w:t>Ryder (in Ivy's body): (摊摊手,语气平静) Beats me. Looks like we swapped bodies or some shit.</w:t>
       </w:r>
     </w:p>
     <w:p>
       <w:pPr>
         <w:spacing w:after="80"/>
-        <w:ind w:firstLine="0" w:left="227" w:right="113"/>
+        <w:ind w:left="227"/>
       </w:pPr>
       <w:r>
         <w:rPr>
-          <w:rFonts w:ascii="STSong" w:hAnsi="STSong" w:eastAsia="STSong"/>
+          <w:rFonts w:ascii="Arial Unicode MS" w:hAnsi="Arial Unicode MS" w:eastAsia="Arial Unicode MS"/>
           <w:b w:val="0"/>
           <w:i w:val="0"/>
           <w:color w:val="222222"/>
           <w:sz w:val="21"/>
         </w:rPr>
-        <w:t>△ Ryder（外貌Ivy）用双手捏了捏自己的胸，表情好奇。</w:t>
+        <w:t>▲ Ivy (in Ryder's body)剧烈震惊。</w:t>
       </w:r>
     </w:p>
     <w:p>
@@ -821,38 +1121,70 @@
       </w:pPr>
       <w:r>
         <w:rPr>
-          <w:rFonts w:ascii="STSong" w:hAnsi="STSong" w:eastAsia="STSong"/>
+          <w:rFonts w:ascii="Arial Unicode MS" w:hAnsi="Arial Unicode MS" w:eastAsia="Arial Unicode MS"/>
           <w:b/>
           <w:i w:val="0"/>
           <w:color w:val="222222"/>
           <w:sz w:val="21"/>
         </w:rPr>
-        <w:t>Ryder（外貌Ivy）：（小声嘟囔）好软。</w:t>
+        <w:t>Ivy (in Ryder's body): WHAT?!</w:t>
       </w:r>
     </w:p>
     <w:p>
       <w:pPr>
         <w:spacing w:after="80"/>
-        <w:ind w:left="964" w:hanging="964"/>
+        <w:ind w:left="227"/>
       </w:pPr>
       <w:r>
         <w:rPr>
-          <w:rFonts w:ascii="STSong" w:hAnsi="STSong" w:eastAsia="STSong"/>
+          <w:rFonts w:ascii="Arial Unicode MS" w:hAnsi="Arial Unicode MS" w:eastAsia="Arial Unicode MS"/>
+          <w:b w:val="0"/>
+          <w:i w:val="0"/>
+          <w:color w:val="222222"/>
+          <w:sz w:val="21"/>
+        </w:rPr>
+        <w:t>▲ Ryder (in Ivy's body) 随后低头用双手捏了捏自己的胸,表情好奇又玩味。</w:t>
+      </w:r>
+    </w:p>
+    <w:p>
+      <w:pPr>
+        <w:spacing w:after="80"/>
+        <w:ind w:left="964" w:hanging="964"/>
+      </w:pPr>
+      <w:r>
+        <w:rPr>
+          <w:rFonts w:ascii="Arial Unicode MS" w:hAnsi="Arial Unicode MS" w:eastAsia="Arial Unicode MS"/>
           <w:b/>
           <w:i w:val="0"/>
           <w:color w:val="222222"/>
           <w:sz w:val="21"/>
         </w:rPr>
-        <w:t>Ivy（外貌Ryder）：（尖叫）啊啊啊啊！</w:t>
+        <w:t>Ryder (in Ivy's body): (小声嘟囔) Damn... These are actually pretty soft.</w:t>
       </w:r>
     </w:p>
     <w:p>
       <w:pPr>
-        <w:pStyle w:val="Heading2"/>
+        <w:spacing w:after="80"/>
+        <w:ind w:left="964" w:hanging="964"/>
       </w:pPr>
       <w:r>
         <w:rPr>
-          <w:rFonts w:ascii="STSong" w:hAnsi="STSong" w:eastAsia="STSong"/>
+          <w:rFonts w:ascii="Arial Unicode MS" w:hAnsi="Arial Unicode MS" w:eastAsia="Arial Unicode MS"/>
+          <w:b/>
+          <w:i w:val="0"/>
+          <w:color w:val="222222"/>
+          <w:sz w:val="21"/>
+        </w:rPr>
+        <w:t>Ivy (in Ryder's body): (尖叫) AHHHH!!! STOP TOUCHING MY BODY, YOU PERV!</w:t>
+      </w:r>
+    </w:p>
+    <w:p>
+      <w:pPr>
+        <w:pStyle w:val="Heading2"/>
+      </w:pPr>
+      <w:r>
+        <w:rPr>
+          <w:rFonts w:ascii="Arial Unicode MS" w:hAnsi="Arial Unicode MS" w:eastAsia="Arial Unicode MS"/>
           <w:b/>
           <w:i w:val="0"/>
           <w:color w:val="A86543"/>
@@ -867,7 +1199,7 @@
       </w:pPr>
       <w:r>
         <w:rPr>
-          <w:rFonts w:ascii="STSong" w:hAnsi="STSong" w:eastAsia="STSong"/>
+          <w:rFonts w:ascii="Arial Unicode MS" w:hAnsi="Arial Unicode MS" w:eastAsia="Arial Unicode MS"/>
           <w:b/>
           <w:i w:val="0"/>
           <w:color w:val="222222"/>
@@ -883,13 +1215,13 @@
       </w:pPr>
       <w:r>
         <w:rPr>
-          <w:rFonts w:ascii="STSong" w:hAnsi="STSong" w:eastAsia="STSong"/>
+          <w:rFonts w:ascii="Arial Unicode MS" w:hAnsi="Arial Unicode MS" w:eastAsia="Arial Unicode MS"/>
           <w:b/>
           <w:i w:val="0"/>
           <w:color w:val="222222"/>
           <w:sz w:val="21"/>
         </w:rPr>
-        <w:t>人物：Ivy（外貌Ryder）、Ryder（外貌Ivy）</w:t>
+        <w:t>人物: Ivy (in Ryder's body)、Ryder (in Ivy's body)</w:t>
       </w:r>
     </w:p>
     <w:p>
@@ -899,13 +1231,13 @@
       </w:pPr>
       <w:r>
         <w:rPr>
-          <w:rFonts w:ascii="STSong" w:hAnsi="STSong" w:eastAsia="STSong"/>
+          <w:rFonts w:ascii="Arial Unicode MS" w:hAnsi="Arial Unicode MS" w:eastAsia="Arial Unicode MS"/>
           <w:b/>
           <w:i w:val="0"/>
           <w:color w:val="222222"/>
           <w:sz w:val="21"/>
         </w:rPr>
-        <w:t>Ryder（外貌Ivy）：鬼知道你突然扑上来强吻我，才搞出这种事！</w:t>
+        <w:t>Ryder (in Ivy's body): (愤怒地指着她) Hell knows what possessed you to force a kiss on me like that! That's why we're in this mess!</w:t>
       </w:r>
     </w:p>
     <w:p>
@@ -915,29 +1247,29 @@
       </w:pPr>
       <w:r>
         <w:rPr>
-          <w:rFonts w:ascii="STSong" w:hAnsi="STSong" w:eastAsia="STSong"/>
+          <w:rFonts w:ascii="Arial Unicode MS" w:hAnsi="Arial Unicode MS" w:eastAsia="Arial Unicode MS"/>
           <w:b/>
           <w:i w:val="0"/>
           <w:color w:val="222222"/>
           <w:sz w:val="21"/>
         </w:rPr>
-        <w:t>Ivy（外貌Ryder）：（生气）谁强吻你！我是要向 Adrian告白，是你故意不穿衣服躲在这里。</w:t>
+        <w:t>Ivy (in Ryder's body): (生气) I didn't "force a kiss" on you! I was confessing to Adrian. You're the one who decided to shower here half-naked!</w:t>
       </w:r>
     </w:p>
     <w:p>
       <w:pPr>
         <w:spacing w:after="80"/>
-        <w:ind w:firstLine="0" w:left="227" w:right="113"/>
+        <w:ind w:left="227"/>
       </w:pPr>
       <w:r>
         <w:rPr>
-          <w:rFonts w:ascii="STSong" w:hAnsi="STSong" w:eastAsia="STSong"/>
+          <w:rFonts w:ascii="Arial Unicode MS" w:hAnsi="Arial Unicode MS" w:eastAsia="Arial Unicode MS"/>
           <w:b w:val="0"/>
           <w:i w:val="0"/>
           <w:color w:val="222222"/>
           <w:sz w:val="21"/>
         </w:rPr>
-        <w:t>△Ryder （外貌Ivy）抱臂冷笑，上下打量她。</w:t>
+        <w:t>▲ Ryder (in Ivy's body) 抱臂冷笑,上下打量着她。</w:t>
       </w:r>
     </w:p>
     <w:p>
@@ -947,29 +1279,29 @@
       </w:pPr>
       <w:r>
         <w:rPr>
-          <w:rFonts w:ascii="STSong" w:hAnsi="STSong" w:eastAsia="STSong"/>
+          <w:rFonts w:ascii="Arial Unicode MS" w:hAnsi="Arial Unicode MS" w:eastAsia="Arial Unicode MS"/>
           <w:b/>
           <w:i w:val="0"/>
           <w:color w:val="222222"/>
           <w:sz w:val="21"/>
         </w:rPr>
-        <w:t>Ryder（外貌Ivy）：你喜欢 Adrian那个伪君子？</w:t>
+        <w:t>Ryder (in Ivy's body): (嗤笑) You like Adrian? That fake-ass bastard?</w:t>
       </w:r>
     </w:p>
     <w:p>
       <w:pPr>
         <w:spacing w:after="80"/>
-        <w:ind w:firstLine="0" w:left="227" w:right="113"/>
+        <w:ind w:left="227"/>
       </w:pPr>
       <w:r>
         <w:rPr>
-          <w:rFonts w:ascii="STSong" w:hAnsi="STSong" w:eastAsia="STSong"/>
+          <w:rFonts w:ascii="Arial Unicode MS" w:hAnsi="Arial Unicode MS" w:eastAsia="Arial Unicode MS"/>
           <w:b w:val="0"/>
           <w:i w:val="0"/>
           <w:color w:val="222222"/>
           <w:sz w:val="21"/>
         </w:rPr>
-        <w:t>△ Ivy（外貌Ryder）翻了个白眼，没有说话。</w:t>
+        <w:t>▲ Ivy (in Ryder's body) 翻了个白眼,别过头去,没有回答。</w:t>
       </w:r>
     </w:p>
     <w:p>
@@ -979,45 +1311,109 @@
       </w:pPr>
       <w:r>
         <w:rPr>
-          <w:rFonts w:ascii="STSong" w:hAnsi="STSong" w:eastAsia="STSong"/>
+          <w:rFonts w:ascii="Arial Unicode MS" w:hAnsi="Arial Unicode MS" w:eastAsia="Arial Unicode MS"/>
           <w:b/>
           <w:i w:val="0"/>
           <w:color w:val="222222"/>
           <w:sz w:val="21"/>
         </w:rPr>
-        <w:t>Ryder（外貌Ivy）：Adrian就是个道貌岸然的家伙，我劝你还是……</w:t>
+        <w:t>Ryder (in Ivy's body):Adrian's a two-faced asshole. If you had any sense, you'd—</w:t>
       </w:r>
     </w:p>
     <w:p>
       <w:pPr>
         <w:spacing w:after="80"/>
-        <w:ind w:firstLine="0" w:left="227" w:right="113"/>
+        <w:ind w:left="964" w:hanging="964"/>
       </w:pPr>
       <w:r>
         <w:rPr>
-          <w:rFonts w:ascii="STSong" w:hAnsi="STSong" w:eastAsia="STSong"/>
+          <w:rFonts w:ascii="Arial Unicode MS" w:hAnsi="Arial Unicode MS" w:eastAsia="Arial Unicode MS"/>
+          <w:b/>
+          <w:i w:val="0"/>
+          <w:color w:val="222222"/>
+          <w:sz w:val="21"/>
+        </w:rPr>
+        <w:t>Ivy (in Ryder's body): (打断,声音拔高) At least he's better than you.</w:t>
+      </w:r>
+    </w:p>
+    <w:p>
+      <w:pPr>
+        <w:spacing w:after="80"/>
+        <w:ind w:left="964" w:hanging="964"/>
+      </w:pPr>
+      <w:r>
+        <w:rPr>
+          <w:rFonts w:ascii="Arial Unicode MS" w:hAnsi="Arial Unicode MS" w:eastAsia="Arial Unicode MS"/>
+          <w:b/>
+          <w:i w:val="0"/>
+          <w:color w:val="222222"/>
+          <w:sz w:val="21"/>
+        </w:rPr>
+        <w:t>Ryder (in Ivy's body): (指向自己) Me?</w:t>
+      </w:r>
+    </w:p>
+    <w:p>
+      <w:pPr>
+        <w:spacing w:after="80"/>
+        <w:ind w:left="964" w:hanging="964"/>
+      </w:pPr>
+      <w:r>
+        <w:rPr>
+          <w:rFonts w:ascii="Arial Unicode MS" w:hAnsi="Arial Unicode MS" w:eastAsia="Arial Unicode MS"/>
+          <w:b/>
+          <w:i w:val="0"/>
+          <w:color w:val="222222"/>
+          <w:sz w:val="21"/>
+        </w:rPr>
+        <w:t>Ivy (in Ryder's body): (继续攻击) Yeah. Adrian's the real one dedicated to his dreams. You? You're just a spoiled brat wasting daddy's money and a shameless pervert.</w:t>
+      </w:r>
+    </w:p>
+    <w:p>
+      <w:pPr>
+        <w:spacing w:after="80"/>
+        <w:ind w:left="227"/>
+      </w:pPr>
+      <w:r>
+        <w:rPr>
+          <w:rFonts w:ascii="Arial Unicode MS" w:hAnsi="Arial Unicode MS" w:eastAsia="Arial Unicode MS"/>
           <w:b w:val="0"/>
           <w:i w:val="0"/>
           <w:color w:val="222222"/>
           <w:sz w:val="21"/>
         </w:rPr>
-        <w:t>△ Ivy（外貌Ryder）打断Ryder（外貌Ivy）的话，着急地解释。</w:t>
+        <w:t>▲ Ryder (in Ivy's body) 被气笑，他盯着 Ivy (in Ryder's body),一步步逼近。</w:t>
       </w:r>
     </w:p>
     <w:p>
       <w:pPr>
         <w:spacing w:after="80"/>
-        <w:ind w:left="964" w:hanging="964"/>
+        <w:ind w:left="227"/>
       </w:pPr>
       <w:r>
         <w:rPr>
-          <w:rFonts w:ascii="STSong" w:hAnsi="STSong" w:eastAsia="STSong"/>
+          <w:rFonts w:ascii="Arial Unicode MS" w:hAnsi="Arial Unicode MS" w:eastAsia="Arial Unicode MS"/>
+          <w:b w:val="0"/>
+          <w:i w:val="0"/>
+          <w:color w:val="222222"/>
+          <w:sz w:val="21"/>
+        </w:rPr>
+        <w:t>▲ Ivy (in Ryder's body) 下意识后退,直到背贴上墙。</w:t>
+      </w:r>
+    </w:p>
+    <w:p>
+      <w:pPr>
+        <w:spacing w:after="80"/>
+        <w:ind w:left="964" w:hanging="964"/>
+      </w:pPr>
+      <w:r>
+        <w:rPr>
+          <w:rFonts w:ascii="Arial Unicode MS" w:hAnsi="Arial Unicode MS" w:eastAsia="Arial Unicode MS"/>
           <w:b/>
           <w:i w:val="0"/>
           <w:color w:val="222222"/>
           <w:sz w:val="21"/>
         </w:rPr>
-        <w:t>Ivy（外貌Ryder）：那他也比你好。</w:t>
+        <w:t>Ryder (in Ivy's body): Say that again.</w:t>
       </w:r>
     </w:p>
     <w:p>
@@ -1027,61 +1423,125 @@
       </w:pPr>
       <w:r>
         <w:rPr>
-          <w:rFonts w:ascii="STSong" w:hAnsi="STSong" w:eastAsia="STSong"/>
+          <w:rFonts w:ascii="Arial Unicode MS" w:hAnsi="Arial Unicode MS" w:eastAsia="Arial Unicode MS"/>
           <w:b/>
           <w:i w:val="0"/>
           <w:color w:val="222222"/>
           <w:sz w:val="21"/>
         </w:rPr>
-        <w:t>Ryder（外貌Ivy）：(指向自己)我？</w:t>
+        <w:t>Ivy (in Ryder's body): (心虚) Adrian... Adrian is better than you—</w:t>
       </w:r>
     </w:p>
     <w:p>
       <w:pPr>
         <w:spacing w:after="80"/>
-        <w:ind w:left="964" w:hanging="964"/>
+        <w:ind w:left="227"/>
       </w:pPr>
       <w:r>
         <w:rPr>
-          <w:rFonts w:ascii="STSong" w:hAnsi="STSong" w:eastAsia="STSong"/>
+          <w:rFonts w:ascii="Arial Unicode MS" w:hAnsi="Arial Unicode MS" w:eastAsia="Arial Unicode MS"/>
+          <w:b w:val="0"/>
+          <w:i w:val="0"/>
+          <w:color w:val="222222"/>
+          <w:sz w:val="21"/>
+        </w:rPr>
+        <w:t>▲ Ryder (in Ivy's body) 盯着她几秒,突然松开,怒意消失,嘴角勾起一抹坏笑。</w:t>
+      </w:r>
+    </w:p>
+    <w:p>
+      <w:pPr>
+        <w:spacing w:after="80"/>
+        <w:ind w:left="227"/>
+      </w:pPr>
+      <w:r>
+        <w:rPr>
+          <w:rFonts w:ascii="Arial Unicode MS" w:hAnsi="Arial Unicode MS" w:eastAsia="Arial Unicode MS"/>
+          <w:b w:val="0"/>
+          <w:i w:val="0"/>
+          <w:color w:val="222222"/>
+          <w:sz w:val="21"/>
+        </w:rPr>
+        <w:t>▲ 他故意抬起手,慢慢放在自己的胸前。</w:t>
+      </w:r>
+    </w:p>
+    <w:p>
+      <w:pPr>
+        <w:spacing w:after="80"/>
+        <w:ind w:left="964" w:hanging="964"/>
+      </w:pPr>
+      <w:r>
+        <w:rPr>
+          <w:rFonts w:ascii="Arial Unicode MS" w:hAnsi="Arial Unicode MS" w:eastAsia="Arial Unicode MS"/>
           <w:b/>
           <w:i w:val="0"/>
           <w:color w:val="222222"/>
           <w:sz w:val="21"/>
         </w:rPr>
-        <w:t>Ivy（外貌Ryder）：你就是个无所事事的二世祖，他才是真正的Whitmore继承人，看你是嫉妒他吧。</w:t>
+        <w:t>Ryder (in Ivy's body): (挑衅地) Oh, since you said I'm a pervert... Well then...</w:t>
       </w:r>
     </w:p>
     <w:p>
       <w:pPr>
         <w:spacing w:after="80"/>
-        <w:ind w:firstLine="0" w:left="227" w:right="113"/>
+        <w:ind w:left="227"/>
       </w:pPr>
       <w:r>
         <w:rPr>
-          <w:rFonts w:ascii="STSong" w:hAnsi="STSong" w:eastAsia="STSong"/>
+          <w:rFonts w:ascii="Arial Unicode MS" w:hAnsi="Arial Unicode MS" w:eastAsia="Arial Unicode MS"/>
           <w:b w:val="0"/>
           <w:i w:val="0"/>
           <w:color w:val="222222"/>
           <w:sz w:val="21"/>
         </w:rPr>
-        <w:t>△ Ryder（外貌Ivy）的眼神冷下来，严肃地盯着Ivy（外貌Ryder）。</w:t>
+        <w:t>▲ 他轻轻捏了一下自己的胸,表情玩味。</w:t>
       </w:r>
     </w:p>
     <w:p>
       <w:pPr>
         <w:spacing w:after="80"/>
-        <w:ind w:firstLine="0" w:left="227" w:right="113"/>
+        <w:ind w:left="964" w:hanging="964"/>
       </w:pPr>
       <w:r>
         <w:rPr>
-          <w:rFonts w:ascii="STSong" w:hAnsi="STSong" w:eastAsia="STSong"/>
+          <w:rFonts w:ascii="Arial Unicode MS" w:hAnsi="Arial Unicode MS" w:eastAsia="Arial Unicode MS"/>
+          <w:b/>
+          <w:i w:val="0"/>
+          <w:color w:val="222222"/>
+          <w:sz w:val="21"/>
+        </w:rPr>
+        <w:t>Ivy (in Ryder's body): (瞪大眼睛) What the hell are you doing?!</w:t>
+      </w:r>
+    </w:p>
+    <w:p>
+      <w:pPr>
+        <w:spacing w:after="80"/>
+        <w:ind w:left="964" w:hanging="964"/>
+      </w:pPr>
+      <w:r>
+        <w:rPr>
+          <w:rFonts w:ascii="Arial Unicode MS" w:hAnsi="Arial Unicode MS" w:eastAsia="Arial Unicode MS"/>
+          <w:b/>
+          <w:i w:val="0"/>
+          <w:color w:val="222222"/>
+          <w:sz w:val="21"/>
+        </w:rPr>
+        <w:t>Ryder (in Ivy's body): (挑衅) It's my body now, right? I can do whatever I want with it.</w:t>
+      </w:r>
+    </w:p>
+    <w:p>
+      <w:pPr>
+        <w:spacing w:after="80"/>
+        <w:ind w:left="227"/>
+      </w:pPr>
+      <w:r>
+        <w:rPr>
+          <w:rFonts w:ascii="Arial Unicode MS" w:hAnsi="Arial Unicode MS" w:eastAsia="Arial Unicode MS"/>
           <w:b w:val="0"/>
           <w:i w:val="0"/>
           <w:color w:val="222222"/>
           <w:sz w:val="21"/>
         </w:rPr>
-        <w:t>△Ryder（外貌Ivy）被气笑，一把将Ivy（外貌Ryder）逼到墙边。</w:t>
+        <w:t>▲ Ryder (in Ivy's body)抓起 的长发,故意在手里比划。</w:t>
       </w:r>
     </w:p>
     <w:p>
@@ -1091,13 +1551,13 @@
       </w:pPr>
       <w:r>
         <w:rPr>
-          <w:rFonts w:ascii="STSong" w:hAnsi="STSong" w:eastAsia="STSong"/>
+          <w:rFonts w:ascii="Arial Unicode MS" w:hAnsi="Arial Unicode MS" w:eastAsia="Arial Unicode MS"/>
           <w:b/>
           <w:i w:val="0"/>
           <w:color w:val="222222"/>
           <w:sz w:val="21"/>
         </w:rPr>
-        <w:t>Ryder（外貌Ivy）： 你再说一遍？</w:t>
+        <w:t>Ryder (in Ivy's body): (若有所思) And you know, nerd... I think you'd look way better with short hair. Like, way shorter.</w:t>
       </w:r>
     </w:p>
     <w:p>
@@ -1107,29 +1567,29 @@
       </w:pPr>
       <w:r>
         <w:rPr>
-          <w:rFonts w:ascii="STSong" w:hAnsi="STSong" w:eastAsia="STSong"/>
+          <w:rFonts w:ascii="Arial Unicode MS" w:hAnsi="Arial Unicode MS" w:eastAsia="Arial Unicode MS"/>
           <w:b/>
           <w:i w:val="0"/>
           <w:color w:val="222222"/>
           <w:sz w:val="21"/>
         </w:rPr>
-        <w:t>Ivy（外貌Ryder）： （心虚）Adrian就是比你好……</w:t>
+        <w:t>Ivy (in Ryder's body): (尖叫) Don't you DARE touch my hair!</w:t>
       </w:r>
     </w:p>
     <w:p>
       <w:pPr>
         <w:spacing w:after="80"/>
-        <w:ind w:firstLine="0" w:left="227" w:right="113"/>
+        <w:ind w:left="227"/>
       </w:pPr>
       <w:r>
         <w:rPr>
-          <w:rFonts w:ascii="STSong" w:hAnsi="STSong" w:eastAsia="STSong"/>
+          <w:rFonts w:ascii="Arial Unicode MS" w:hAnsi="Arial Unicode MS" w:eastAsia="Arial Unicode MS"/>
           <w:b w:val="0"/>
           <w:i w:val="0"/>
           <w:color w:val="222222"/>
           <w:sz w:val="21"/>
         </w:rPr>
-        <w:t>△Ryder盯着她几秒，忽然松开，怒意变成坏笑，故意把手搭在胸前。</w:t>
+        <w:t>▲ Ivy (in Ryder's body)扑过去想抢,但 Ryder (in Ivy's body) 笑着躲开。Ivy (in Ryder's body)扑了个空,气急之下一把抓住身上的浴巾。</w:t>
       </w:r>
     </w:p>
     <w:p>
@@ -1139,61 +1599,109 @@
       </w:pPr>
       <w:r>
         <w:rPr>
-          <w:rFonts w:ascii="STSong" w:hAnsi="STSong" w:eastAsia="STSong"/>
+          <w:rFonts w:ascii="Arial Unicode MS" w:hAnsi="Arial Unicode MS" w:eastAsia="Arial Unicode MS"/>
           <w:b/>
           <w:i w:val="0"/>
           <w:color w:val="222222"/>
           <w:sz w:val="21"/>
         </w:rPr>
-        <w:t>Ryder（外貌Ivy）： （佯装抓起自己的胸）是吗？那我就不客气了。</w:t>
+        <w:t>Ivy (in Ryder's body): (威胁) Fine! You cut my hair, I'll run naked across the ice rink right now!</w:t>
       </w:r>
     </w:p>
     <w:p>
       <w:pPr>
         <w:spacing w:after="80"/>
-        <w:ind w:left="964" w:hanging="964"/>
+        <w:ind w:left="227"/>
       </w:pPr>
       <w:r>
         <w:rPr>
-          <w:rFonts w:ascii="STSong" w:hAnsi="STSong" w:eastAsia="STSong"/>
+          <w:rFonts w:ascii="Arial Unicode MS" w:hAnsi="Arial Unicode MS" w:eastAsia="Arial Unicode MS"/>
+          <w:b w:val="0"/>
+          <w:i w:val="0"/>
+          <w:color w:val="222222"/>
+          <w:sz w:val="21"/>
+        </w:rPr>
+        <w:t>▲ Ryder 的笑容瞬间消失。</w:t>
+      </w:r>
+    </w:p>
+    <w:p>
+      <w:pPr>
+        <w:spacing w:after="80"/>
+        <w:ind w:left="964" w:hanging="964"/>
+      </w:pPr>
+      <w:r>
+        <w:rPr>
+          <w:rFonts w:ascii="Arial Unicode MS" w:hAnsi="Arial Unicode MS" w:eastAsia="Arial Unicode MS"/>
           <w:b/>
           <w:i w:val="0"/>
           <w:color w:val="222222"/>
           <w:sz w:val="21"/>
         </w:rPr>
-        <w:t>Ivy（外貌Ryder）： 你想干嘛？</w:t>
+        <w:t>Ivy (in Ryder's body): (得意地继续) Let the whole school see their precious hockey MVP is a freaking streaker!</w:t>
       </w:r>
     </w:p>
     <w:p>
       <w:pPr>
         <w:spacing w:after="80"/>
-        <w:ind w:left="964" w:hanging="964"/>
+        <w:ind w:left="227"/>
       </w:pPr>
       <w:r>
         <w:rPr>
-          <w:rFonts w:ascii="STSong" w:hAnsi="STSong" w:eastAsia="STSong"/>
+          <w:rFonts w:ascii="Arial Unicode MS" w:hAnsi="Arial Unicode MS" w:eastAsia="Arial Unicode MS"/>
+          <w:b w:val="0"/>
+          <w:i w:val="0"/>
+          <w:color w:val="222222"/>
+          <w:sz w:val="21"/>
+        </w:rPr>
+        <w:t>▲ Ivy (in Ryder's body)得意地摸了摸自己(Ryder的身体)的腹肌,却被陌生的触感弄得耳根一红,动作瞬间僵住。</w:t>
+      </w:r>
+    </w:p>
+    <w:p>
+      <w:pPr>
+        <w:spacing w:after="80"/>
+        <w:ind w:left="227"/>
+      </w:pPr>
+      <w:r>
+        <w:rPr>
+          <w:rFonts w:ascii="Arial Unicode MS" w:hAnsi="Arial Unicode MS" w:eastAsia="Arial Unicode MS"/>
+          <w:b w:val="0"/>
+          <w:i w:val="0"/>
+          <w:color w:val="222222"/>
+          <w:sz w:val="21"/>
+        </w:rPr>
+        <w:t>▲ Ryder (in Ivy's body) 看到她顶着自己的脸露出害羞表情,莫名也有些不自在,移开视线。</w:t>
+      </w:r>
+    </w:p>
+    <w:p>
+      <w:pPr>
+        <w:spacing w:after="80"/>
+        <w:ind w:left="964" w:hanging="964"/>
+      </w:pPr>
+      <w:r>
+        <w:rPr>
+          <w:rFonts w:ascii="Arial Unicode MS" w:hAnsi="Arial Unicode MS" w:eastAsia="Arial Unicode MS"/>
           <w:b/>
           <w:i w:val="0"/>
           <w:color w:val="222222"/>
           <w:sz w:val="21"/>
         </w:rPr>
-        <w:t>Ryder（外貌Ivy）： 反正现在这具身体归我，我想怎么折腾都行。</w:t>
+        <w:t>Ryder (in Ivy's body): (嫌弃地) Stop making that face. You look ridiculous.</w:t>
       </w:r>
     </w:p>
     <w:p>
       <w:pPr>
         <w:spacing w:after="80"/>
-        <w:ind w:firstLine="0" w:left="227" w:right="113"/>
+        <w:ind w:left="227"/>
       </w:pPr>
       <w:r>
         <w:rPr>
-          <w:rFonts w:ascii="STSong" w:hAnsi="STSong" w:eastAsia="STSong"/>
+          <w:rFonts w:ascii="Arial Unicode MS" w:hAnsi="Arial Unicode MS" w:eastAsia="Arial Unicode MS"/>
           <w:b w:val="0"/>
           <w:i w:val="0"/>
           <w:color w:val="222222"/>
           <w:sz w:val="21"/>
         </w:rPr>
-        <w:t>△Ryder抓起Ivy的长发，故意在手里比划。</w:t>
+        <w:t>▲ Ivy 立刻收回手,故作镇定。</w:t>
       </w:r>
     </w:p>
     <w:p>
@@ -1203,45 +1711,109 @@
       </w:pPr>
       <w:r>
         <w:rPr>
-          <w:rFonts w:ascii="STSong" w:hAnsi="STSong" w:eastAsia="STSong"/>
+          <w:rFonts w:ascii="Arial Unicode MS" w:hAnsi="Arial Unicode MS" w:eastAsia="Arial Unicode MS"/>
           <w:b/>
           <w:i w:val="0"/>
           <w:color w:val="222222"/>
           <w:sz w:val="21"/>
         </w:rPr>
-        <w:t>Ryder（外貌Ivy）： 书呆子，我觉得你剪短点应该好看点。</w:t>
+        <w:t>Ivy (in Ryder's body): (小声嘟囔) ...You started it.</w:t>
       </w:r>
     </w:p>
     <w:p>
       <w:pPr>
         <w:spacing w:after="80"/>
-        <w:ind w:left="964" w:hanging="964"/>
+        <w:ind w:left="227"/>
       </w:pPr>
       <w:r>
         <w:rPr>
-          <w:rFonts w:ascii="STSong" w:hAnsi="STSong" w:eastAsia="STSong"/>
+          <w:rFonts w:ascii="Arial Unicode MS" w:hAnsi="Arial Unicode MS" w:eastAsia="Arial Unicode MS"/>
+          <w:b w:val="0"/>
+          <w:i w:val="0"/>
+          <w:color w:val="222222"/>
+          <w:sz w:val="21"/>
+        </w:rPr>
+        <w:t>▲ 两人互相看着对方僵持几秒,气氛尴尬到极点。</w:t>
+      </w:r>
+    </w:p>
+    <w:p>
+      <w:pPr>
+        <w:spacing w:after="80"/>
+        <w:ind w:left="227"/>
+      </w:pPr>
+      <w:r>
+        <w:rPr>
+          <w:rFonts w:ascii="Arial Unicode MS" w:hAnsi="Arial Unicode MS" w:eastAsia="Arial Unicode MS"/>
+          <w:b w:val="0"/>
+          <w:i w:val="0"/>
+          <w:color w:val="222222"/>
+          <w:sz w:val="21"/>
+        </w:rPr>
+        <w:t>▲ Ivy (in Ryder's body) 率先叹了口气,打破沉默。</w:t>
+      </w:r>
+    </w:p>
+    <w:p>
+      <w:pPr>
+        <w:spacing w:after="80"/>
+        <w:ind w:left="964" w:hanging="964"/>
+      </w:pPr>
+      <w:r>
+        <w:rPr>
+          <w:rFonts w:ascii="Arial Unicode MS" w:hAnsi="Arial Unicode MS" w:eastAsia="Arial Unicode MS"/>
           <w:b/>
           <w:i w:val="0"/>
           <w:color w:val="222222"/>
           <w:sz w:val="21"/>
         </w:rPr>
-        <w:t>Ivy（外貌Ryder）： 你敢剪我头发试试！</w:t>
+        <w:t>Ivy (in Ryder's body): (无奈) Okay. Whatever. Let's just... figure out how to swap back.</w:t>
       </w:r>
     </w:p>
     <w:p>
       <w:pPr>
         <w:spacing w:after="80"/>
-        <w:ind w:firstLine="0" w:left="227" w:right="113"/>
+        <w:ind w:left="964" w:hanging="964"/>
       </w:pPr>
       <w:r>
         <w:rPr>
-          <w:rFonts w:ascii="STSong" w:hAnsi="STSong" w:eastAsia="STSong"/>
+          <w:rFonts w:ascii="Arial Unicode MS" w:hAnsi="Arial Unicode MS" w:eastAsia="Arial Unicode MS"/>
+          <w:b/>
+          <w:i w:val="0"/>
+          <w:color w:val="222222"/>
+          <w:sz w:val="21"/>
+        </w:rPr>
+        <w:t>Ryder (in Ivy's body): (挑眉) How?</w:t>
+      </w:r>
+    </w:p>
+    <w:p>
+      <w:pPr>
+        <w:spacing w:after="80"/>
+        <w:ind w:left="964" w:hanging="964"/>
+      </w:pPr>
+      <w:r>
+        <w:rPr>
+          <w:rFonts w:ascii="Arial Unicode MS" w:hAnsi="Arial Unicode MS" w:eastAsia="Arial Unicode MS"/>
+          <w:b/>
+          <w:i w:val="0"/>
+          <w:color w:val="222222"/>
+          <w:sz w:val="21"/>
+        </w:rPr>
+        <w:t>Ivy (in Ryder's body): (尴尬地开口) Before we... switched... we, uh... we kissed. Right?</w:t>
+      </w:r>
+    </w:p>
+    <w:p>
+      <w:pPr>
+        <w:spacing w:after="80"/>
+        <w:ind w:left="227"/>
+      </w:pPr>
+      <w:r>
+        <w:rPr>
+          <w:rFonts w:ascii="Arial Unicode MS" w:hAnsi="Arial Unicode MS" w:eastAsia="Arial Unicode MS"/>
           <w:b w:val="0"/>
           <w:i w:val="0"/>
           <w:color w:val="222222"/>
           <w:sz w:val="21"/>
         </w:rPr>
-        <w:t>△Ivy扑过去抢，Ryder笑着躲开。Ivy扑了个空，气急之下抓住浴巾。</w:t>
+        <w:t>▲ Ryder 瞬间明白她的意思,两人同时沉默。</w:t>
       </w:r>
     </w:p>
     <w:p>
@@ -1251,29 +1823,45 @@
       </w:pPr>
       <w:r>
         <w:rPr>
-          <w:rFonts w:ascii="STSong" w:hAnsi="STSong" w:eastAsia="STSong"/>
+          <w:rFonts w:ascii="Arial Unicode MS" w:hAnsi="Arial Unicode MS" w:eastAsia="Arial Unicode MS"/>
           <w:b/>
           <w:i w:val="0"/>
           <w:color w:val="222222"/>
           <w:sz w:val="21"/>
         </w:rPr>
-        <w:t>Ivy（外貌Ryder）： 行！你敢剪，我现在就去冰球场裸奔！</w:t>
+        <w:t>Ivy (in Ryder's body): (硬着头皮说) So... maybe if we kiss again... we'll switch back?</w:t>
       </w:r>
     </w:p>
     <w:p>
       <w:pPr>
         <w:spacing w:after="80"/>
-        <w:ind w:firstLine="0" w:left="227" w:right="113"/>
+        <w:ind w:left="964" w:hanging="964"/>
       </w:pPr>
       <w:r>
         <w:rPr>
-          <w:rFonts w:ascii="STSong" w:hAnsi="STSong" w:eastAsia="STSong"/>
+          <w:rFonts w:ascii="Arial Unicode MS" w:hAnsi="Arial Unicode MS" w:eastAsia="Arial Unicode MS"/>
+          <w:b/>
+          <w:i w:val="0"/>
+          <w:color w:val="222222"/>
+          <w:sz w:val="21"/>
+        </w:rPr>
+        <w:t>Ryder (in Ivy's body) OS: The game starts in one hour, and I can't lose it.</w:t>
+      </w:r>
+    </w:p>
+    <w:p>
+      <w:pPr>
+        <w:spacing w:after="80"/>
+        <w:ind w:left="227"/>
+      </w:pPr>
+      <w:r>
+        <w:rPr>
+          <w:rFonts w:ascii="Arial Unicode MS" w:hAnsi="Arial Unicode MS" w:eastAsia="Arial Unicode MS"/>
           <w:b w:val="0"/>
           <w:i w:val="0"/>
           <w:color w:val="222222"/>
           <w:sz w:val="21"/>
         </w:rPr>
-        <w:t>△Ryder笑容瞬间消失。</w:t>
+        <w:t>▲ 两人依旧尴尬地面对面站着,谁也不愿意先动。</w:t>
       </w:r>
     </w:p>
     <w:p>
@@ -1283,77 +1871,93 @@
       </w:pPr>
       <w:r>
         <w:rPr>
-          <w:rFonts w:ascii="STSong" w:hAnsi="STSong" w:eastAsia="STSong"/>
+          <w:rFonts w:ascii="Arial Unicode MS" w:hAnsi="Arial Unicode MS" w:eastAsia="Arial Unicode MS"/>
           <w:b/>
           <w:i w:val="0"/>
           <w:color w:val="222222"/>
           <w:sz w:val="21"/>
         </w:rPr>
-        <w:t>Ivy（外貌Ryder）： 让全校看看他们的冰球MVP是个暴露狂！</w:t>
+        <w:t>Ryder (in Ivy's body): (深吸一口气) Quick. Let's just get this over with.</w:t>
       </w:r>
     </w:p>
     <w:p>
       <w:pPr>
         <w:spacing w:after="80"/>
-        <w:ind w:firstLine="0" w:left="227" w:right="113"/>
+        <w:ind w:left="227"/>
       </w:pPr>
       <w:r>
         <w:rPr>
-          <w:rFonts w:ascii="STSong" w:hAnsi="STSong" w:eastAsia="STSong"/>
+          <w:rFonts w:ascii="Arial Unicode MS" w:hAnsi="Arial Unicode MS" w:eastAsia="Arial Unicode MS"/>
           <w:b w:val="0"/>
           <w:i w:val="0"/>
           <w:color w:val="222222"/>
           <w:sz w:val="21"/>
         </w:rPr>
-        <w:t>△Ivy得意地摸了摸腹肌，却被陌生的触感弄得耳根一红。</w:t>
+        <w:t>▲ Ivy 硬着头皮往前挪了一小步,Ryder 也慢慢靠近。</w:t>
       </w:r>
     </w:p>
     <w:p>
       <w:pPr>
         <w:spacing w:after="80"/>
-        <w:ind w:firstLine="0" w:left="227" w:right="113"/>
+        <w:ind w:left="227"/>
       </w:pPr>
       <w:r>
         <w:rPr>
-          <w:rFonts w:ascii="STSong" w:hAnsi="STSong" w:eastAsia="STSong"/>
+          <w:rFonts w:ascii="Arial Unicode MS" w:hAnsi="Arial Unicode MS" w:eastAsia="Arial Unicode MS"/>
           <w:b w:val="0"/>
           <w:i w:val="0"/>
           <w:color w:val="222222"/>
           <w:sz w:val="21"/>
         </w:rPr>
-        <w:t>△Ryder看见她顶着自己的脸害羞，自己也莫名有些不自在。</w:t>
+        <w:t>▲ 两人紧张地闭上眼,一点点凑近,鼻尖轻轻碰到一起。</w:t>
       </w:r>
     </w:p>
     <w:p>
       <w:pPr>
         <w:spacing w:after="80"/>
-        <w:ind w:left="964" w:hanging="964"/>
+        <w:ind w:left="227"/>
       </w:pPr>
       <w:r>
         <w:rPr>
-          <w:rFonts w:ascii="STSong" w:hAnsi="STSong" w:eastAsia="STSong"/>
+          <w:rFonts w:ascii="Arial Unicode MS" w:hAnsi="Arial Unicode MS" w:eastAsia="Arial Unicode MS"/>
+          <w:b w:val="0"/>
+          <w:i w:val="0"/>
+          <w:color w:val="222222"/>
+          <w:sz w:val="21"/>
+        </w:rPr>
+        <w:t>▲ 就在嘴唇即将碰上的瞬间，两人被冰球赛场现场广播打断。</w:t>
+      </w:r>
+    </w:p>
+    <w:p>
+      <w:pPr>
+        <w:spacing w:after="80"/>
+        <w:ind w:left="964" w:hanging="964"/>
+      </w:pPr>
+      <w:r>
+        <w:rPr>
+          <w:rFonts w:ascii="Arial Unicode MS" w:hAnsi="Arial Unicode MS" w:eastAsia="Arial Unicode MS"/>
           <w:b/>
           <w:i w:val="0"/>
           <w:color w:val="222222"/>
           <w:sz w:val="21"/>
         </w:rPr>
-        <w:t>Ryder（外貌Ivy）： 别用我的脸露出这种表情。</w:t>
+        <w:t>现场广播 (VO): (突然响起) Attention all players! Report to the ice rink immediately! The season opener begins in five minutes!</w:t>
       </w:r>
     </w:p>
     <w:p>
       <w:pPr>
         <w:spacing w:after="80"/>
-        <w:ind w:firstLine="0" w:left="227" w:right="113"/>
+        <w:ind w:left="227"/>
       </w:pPr>
       <w:r>
         <w:rPr>
-          <w:rFonts w:ascii="STSong" w:hAnsi="STSong" w:eastAsia="STSong"/>
+          <w:rFonts w:ascii="Arial Unicode MS" w:hAnsi="Arial Unicode MS" w:eastAsia="Arial Unicode MS"/>
           <w:b w:val="0"/>
           <w:i w:val="0"/>
           <w:color w:val="222222"/>
           <w:sz w:val="21"/>
         </w:rPr>
-        <w:t>△Ivy立刻收手，故作镇定。</w:t>
+        <w:t>▲ 两人同时吓得睁眼,猛地弹开。</w:t>
       </w:r>
     </w:p>
     <w:p>
@@ -1363,326 +1967,134 @@
       </w:pPr>
       <w:r>
         <w:rPr>
-          <w:rFonts w:ascii="STSong" w:hAnsi="STSong" w:eastAsia="STSong"/>
+          <w:rFonts w:ascii="Arial Unicode MS" w:hAnsi="Arial Unicode MS" w:eastAsia="Arial Unicode MS"/>
           <w:b/>
           <w:i w:val="0"/>
           <w:color w:val="222222"/>
           <w:sz w:val="21"/>
         </w:rPr>
-        <w:t>Ivy（外貌Ryder）： ……还不是你先开始的。</w:t>
+        <w:t>Ryder (in Ivy's body): What the hell?! Why'd you pull back?!</w:t>
       </w:r>
     </w:p>
     <w:p>
       <w:pPr>
         <w:spacing w:after="80"/>
-        <w:ind w:firstLine="0" w:left="227" w:right="113"/>
+        <w:ind w:left="964" w:hanging="964"/>
       </w:pPr>
       <w:r>
         <w:rPr>
-          <w:rFonts w:ascii="STSong" w:hAnsi="STSong" w:eastAsia="STSong"/>
+          <w:rFonts w:ascii="Arial Unicode MS" w:hAnsi="Arial Unicode MS" w:eastAsia="Arial Unicode MS"/>
+          <w:b/>
+          <w:i w:val="0"/>
+          <w:color w:val="222222"/>
+          <w:sz w:val="21"/>
+        </w:rPr>
+        <w:t>Ivy (in Ryder's body): (慌乱) You pulled back first!</w:t>
+      </w:r>
+    </w:p>
+    <w:p>
+      <w:pPr>
+        <w:spacing w:after="80"/>
+        <w:ind w:left="964" w:hanging="964"/>
+      </w:pPr>
+      <w:r>
+        <w:rPr>
+          <w:rFonts w:ascii="Arial Unicode MS" w:hAnsi="Arial Unicode MS" w:eastAsia="Arial Unicode MS"/>
+          <w:b/>
+          <w:i w:val="0"/>
+          <w:color w:val="222222"/>
+          <w:sz w:val="21"/>
+        </w:rPr>
+        <w:t>Ryder (in Ivy's body): If we don't swap back right now, you're gonna have to play that game!</w:t>
+      </w:r>
+    </w:p>
+    <w:p>
+      <w:pPr>
+        <w:spacing w:after="80"/>
+        <w:ind w:left="964" w:hanging="964"/>
+      </w:pPr>
+      <w:r>
+        <w:rPr>
+          <w:rFonts w:ascii="Arial Unicode MS" w:hAnsi="Arial Unicode MS" w:eastAsia="Arial Unicode MS"/>
+          <w:b/>
+          <w:i w:val="0"/>
+          <w:color w:val="222222"/>
+          <w:sz w:val="21"/>
+        </w:rPr>
+        <w:t>Ivy (in Ryder's body): (崩溃) I don't know how to play hockey!</w:t>
+      </w:r>
+    </w:p>
+    <w:p>
+      <w:pPr>
+        <w:spacing w:after="80"/>
+        <w:ind w:left="964" w:hanging="964"/>
+      </w:pPr>
+      <w:r>
+        <w:rPr>
+          <w:rFonts w:ascii="Arial Unicode MS" w:hAnsi="Arial Unicode MS" w:eastAsia="Arial Unicode MS"/>
+          <w:b/>
+          <w:i w:val="0"/>
+          <w:color w:val="222222"/>
+          <w:sz w:val="21"/>
+        </w:rPr>
+        <w:t>Ryder (in Ivy's body): Then hold still.</w:t>
+      </w:r>
+    </w:p>
+    <w:p>
+      <w:pPr>
+        <w:spacing w:after="80"/>
+        <w:ind w:left="227"/>
+      </w:pPr>
+      <w:r>
+        <w:rPr>
+          <w:rFonts w:ascii="Arial Unicode MS" w:hAnsi="Arial Unicode MS" w:eastAsia="Arial Unicode MS"/>
           <w:b w:val="0"/>
           <w:i w:val="0"/>
           <w:color w:val="222222"/>
           <w:sz w:val="21"/>
         </w:rPr>
-        <w:t>△两人互相看着对方僵持几秒后，Ivy（外貌Ryder）率先开口。</w:t>
+        <w:t>▲ Ivy 深吸一口气,主动靠近。Ryder 也迎上去。</w:t>
       </w:r>
     </w:p>
     <w:p>
       <w:pPr>
         <w:spacing w:after="80"/>
-        <w:ind w:left="964" w:hanging="964"/>
+        <w:ind w:left="227"/>
       </w:pPr>
       <w:r>
         <w:rPr>
-          <w:rFonts w:ascii="STSong" w:hAnsi="STSong" w:eastAsia="STSong"/>
-          <w:b/>
-          <w:i w:val="0"/>
-          <w:color w:val="222222"/>
-          <w:sz w:val="21"/>
-        </w:rPr>
-        <w:t>Ivy（外貌Ryder）： 算了，咱们还是先换回来吧。</w:t>
-      </w:r>
-    </w:p>
-    <w:p>
-      <w:pPr>
-        <w:spacing w:after="80"/>
-        <w:ind w:left="964" w:hanging="964"/>
-      </w:pPr>
-      <w:r>
-        <w:rPr>
-          <w:rFonts w:ascii="STSong" w:hAnsi="STSong" w:eastAsia="STSong"/>
-          <w:b/>
-          <w:i w:val="0"/>
-          <w:color w:val="222222"/>
-          <w:sz w:val="21"/>
-        </w:rPr>
-        <w:t>Ryder（外貌Ivy）： 怎么换？</w:t>
-      </w:r>
-    </w:p>
-    <w:p>
-      <w:pPr>
-        <w:spacing w:after="80"/>
-        <w:ind w:left="964" w:hanging="964"/>
-      </w:pPr>
-      <w:r>
-        <w:rPr>
-          <w:rFonts w:ascii="STSong" w:hAnsi="STSong" w:eastAsia="STSong"/>
-          <w:b/>
-          <w:i w:val="0"/>
-          <w:color w:val="222222"/>
-          <w:sz w:val="21"/>
-        </w:rPr>
-        <w:t>Ivy（外貌Ryder）： （尴尬开口）我们互换之前……不是亲了一下吗？</w:t>
-      </w:r>
-    </w:p>
-    <w:p>
-      <w:pPr>
-        <w:spacing w:after="80"/>
-        <w:ind w:firstLine="0" w:left="227" w:right="113"/>
-      </w:pPr>
-      <w:r>
-        <w:rPr>
-          <w:rFonts w:ascii="STSong" w:hAnsi="STSong" w:eastAsia="STSong"/>
+          <w:rFonts w:ascii="Arial Unicode MS" w:hAnsi="Arial Unicode MS" w:eastAsia="Arial Unicode MS"/>
           <w:b w:val="0"/>
           <w:i w:val="0"/>
           <w:color w:val="222222"/>
           <w:sz w:val="21"/>
         </w:rPr>
-        <w:t>△Ryder瞬间明白，两人同时沉默。</w:t>
+        <w:t>▲ 两人都僵着身体,闭着眼一点点试探着靠近——</w:t>
       </w:r>
     </w:p>
     <w:p>
       <w:pPr>
         <w:spacing w:after="80"/>
-        <w:ind w:left="964" w:hanging="964"/>
+        <w:ind w:left="227"/>
       </w:pPr>
       <w:r>
         <w:rPr>
-          <w:rFonts w:ascii="STSong" w:hAnsi="STSong" w:eastAsia="STSong"/>
-          <w:b/>
-          <w:i w:val="0"/>
-          <w:color w:val="222222"/>
-          <w:sz w:val="21"/>
-        </w:rPr>
-        <w:t>Ivy（外貌Ryder）： 再亲一次……说不定就能换回来。</w:t>
-      </w:r>
-    </w:p>
-    <w:p>
-      <w:pPr>
-        <w:spacing w:after="80"/>
-        <w:ind w:left="964" w:hanging="964"/>
-      </w:pPr>
-      <w:r>
-        <w:rPr>
-          <w:rFonts w:ascii="STSong" w:hAnsi="STSong" w:eastAsia="STSong"/>
-          <w:b/>
-          <w:i w:val="0"/>
-          <w:color w:val="222222"/>
-          <w:sz w:val="21"/>
-        </w:rPr>
-        <w:t>Ryder（外貌Ivy）（OS）： 比赛还有五分钟就开始了，只能试试了。</w:t>
-      </w:r>
-    </w:p>
-    <w:p>
-      <w:pPr>
-        <w:spacing w:after="80"/>
-        <w:ind w:firstLine="0" w:left="227" w:right="113"/>
-      </w:pPr>
-      <w:r>
-        <w:rPr>
-          <w:rFonts w:ascii="STSong" w:hAnsi="STSong" w:eastAsia="STSong"/>
+          <w:rFonts w:ascii="Arial Unicode MS" w:hAnsi="Arial Unicode MS" w:eastAsia="Arial Unicode MS"/>
           <w:b w:val="0"/>
           <w:i w:val="0"/>
           <w:color w:val="222222"/>
           <w:sz w:val="21"/>
         </w:rPr>
-        <w:t>△两人尴尬地面对面站着，谁也不愿意先动。</w:t>
+        <w:t>▲ 终于,两人的嘴唇轻轻贴合在一起。</w:t>
       </w:r>
     </w:p>
     <w:p>
       <w:pPr>
-        <w:spacing w:after="80"/>
-        <w:ind w:left="964" w:hanging="964"/>
+        <w:pStyle w:val="Heading2"/>
       </w:pPr>
       <w:r>
         <w:rPr>
-          <w:rFonts w:ascii="STSong" w:hAnsi="STSong" w:eastAsia="STSong"/>
-          <w:b/>
-          <w:i w:val="0"/>
-          <w:color w:val="222222"/>
-          <w:sz w:val="21"/>
-        </w:rPr>
-        <w:t>Ryder（外貌Ivy）： ……来吧。</w:t>
-      </w:r>
-    </w:p>
-    <w:p>
-      <w:pPr>
-        <w:spacing w:after="80"/>
-        <w:ind w:firstLine="0" w:left="227" w:right="113"/>
-      </w:pPr>
-      <w:r>
-        <w:rPr>
-          <w:rFonts w:ascii="STSong" w:hAnsi="STSong" w:eastAsia="STSong"/>
-          <w:b w:val="0"/>
-          <w:i w:val="0"/>
-          <w:color w:val="222222"/>
-          <w:sz w:val="21"/>
-        </w:rPr>
-        <w:t>△Ivy硬着头皮往前挪了一步，Ryder也慢慢靠近。</w:t>
-      </w:r>
-    </w:p>
-    <w:p>
-      <w:pPr>
-        <w:spacing w:after="80"/>
-        <w:ind w:firstLine="0" w:left="227" w:right="113"/>
-      </w:pPr>
-      <w:r>
-        <w:rPr>
-          <w:rFonts w:ascii="STSong" w:hAnsi="STSong" w:eastAsia="STSong"/>
-          <w:b w:val="0"/>
-          <w:i w:val="0"/>
-          <w:color w:val="222222"/>
-          <w:sz w:val="21"/>
-        </w:rPr>
-        <w:t>△两人紧张地闭上眼，一点点凑近，鼻尖轻轻碰到一起。</w:t>
-      </w:r>
-    </w:p>
-    <w:p>
-      <w:pPr>
-        <w:spacing w:after="80"/>
-        <w:ind w:firstLine="0" w:left="227" w:right="113"/>
-      </w:pPr>
-      <w:r>
-        <w:rPr>
-          <w:rFonts w:ascii="STSong" w:hAnsi="STSong" w:eastAsia="STSong"/>
-          <w:b w:val="0"/>
-          <w:i w:val="0"/>
-          <w:color w:val="222222"/>
-          <w:sz w:val="21"/>
-        </w:rPr>
-        <w:t>△就在嘴唇即将碰上的瞬间，两人被冰球赛场现场广播打断。</w:t>
-      </w:r>
-    </w:p>
-    <w:p>
-      <w:pPr>
-        <w:spacing w:after="80"/>
-        <w:ind w:left="964" w:hanging="964"/>
-      </w:pPr>
-      <w:r>
-        <w:rPr>
-          <w:rFonts w:ascii="STSong" w:hAnsi="STSong" w:eastAsia="STSong"/>
-          <w:b/>
-          <w:i w:val="0"/>
-          <w:color w:val="222222"/>
-          <w:sz w:val="21"/>
-        </w:rPr>
-        <w:t>现场广播（VO）： 请双方球员立即前往冰球场，比赛即将开始！</w:t>
-      </w:r>
-    </w:p>
-    <w:p>
-      <w:pPr>
-        <w:spacing w:after="80"/>
-        <w:ind w:firstLine="0" w:left="227" w:right="113"/>
-      </w:pPr>
-      <w:r>
-        <w:rPr>
-          <w:rFonts w:ascii="STSong" w:hAnsi="STSong" w:eastAsia="STSong"/>
-          <w:b w:val="0"/>
-          <w:i w:val="0"/>
-          <w:color w:val="222222"/>
-          <w:sz w:val="21"/>
-        </w:rPr>
-        <w:t>△两人同时吓得睁眼，猛地弹开。</w:t>
-      </w:r>
-    </w:p>
-    <w:p>
-      <w:pPr>
-        <w:spacing w:after="80"/>
-        <w:ind w:left="964" w:hanging="964"/>
-      </w:pPr>
-      <w:r>
-        <w:rPr>
-          <w:rFonts w:ascii="STSong" w:hAnsi="STSong" w:eastAsia="STSong"/>
-          <w:b/>
-          <w:i w:val="0"/>
-          <w:color w:val="222222"/>
-          <w:sz w:val="21"/>
-        </w:rPr>
-        <w:t>Ryder（外貌Ivy）：你躲什么？ 再不换回来，你就真得替我上场了。</w:t>
-      </w:r>
-    </w:p>
-    <w:p>
-      <w:pPr>
-        <w:spacing w:after="80"/>
-        <w:ind w:left="964" w:hanging="964"/>
-      </w:pPr>
-      <w:r>
-        <w:rPr>
-          <w:rFonts w:ascii="STSong" w:hAnsi="STSong" w:eastAsia="STSong"/>
-          <w:b/>
-          <w:i w:val="0"/>
-          <w:color w:val="222222"/>
-          <w:sz w:val="21"/>
-        </w:rPr>
-        <w:t>Ivy（外貌Ryder）： 我不会打冰球！</w:t>
-      </w:r>
-    </w:p>
-    <w:p>
-      <w:pPr>
-        <w:spacing w:after="80"/>
-        <w:ind w:left="964" w:hanging="964"/>
-      </w:pPr>
-      <w:r>
-        <w:rPr>
-          <w:rFonts w:ascii="STSong" w:hAnsi="STSong" w:eastAsia="STSong"/>
-          <w:b/>
-          <w:i w:val="0"/>
-          <w:color w:val="222222"/>
-          <w:sz w:val="21"/>
-        </w:rPr>
-        <w:t>Ryder（外貌Ivy）： 那别乱动。</w:t>
-      </w:r>
-    </w:p>
-    <w:p>
-      <w:pPr>
-        <w:spacing w:after="80"/>
-        <w:ind w:firstLine="0" w:left="227" w:right="113"/>
-      </w:pPr>
-      <w:r>
-        <w:rPr>
-          <w:rFonts w:ascii="STSong" w:hAnsi="STSong" w:eastAsia="STSong"/>
-          <w:b w:val="0"/>
-          <w:i w:val="0"/>
-          <w:color w:val="222222"/>
-          <w:sz w:val="21"/>
-        </w:rPr>
-        <w:t>△Ivy深吸一口气，主动靠近；Ryder也迎上去。</w:t>
-      </w:r>
-    </w:p>
-    <w:p>
-      <w:pPr>
-        <w:spacing w:after="80"/>
-        <w:ind w:firstLine="0" w:left="227" w:right="113"/>
-      </w:pPr>
-      <w:r>
-        <w:rPr>
-          <w:rFonts w:ascii="STSong" w:hAnsi="STSong" w:eastAsia="STSong"/>
-          <w:b w:val="0"/>
-          <w:i w:val="0"/>
-          <w:color w:val="222222"/>
-          <w:sz w:val="21"/>
-        </w:rPr>
-        <w:t>△两人都僵着身体，闭着眼一点点试探着靠近，终于轻轻吻上。</w:t>
-      </w:r>
-    </w:p>
-    <w:p>
-      <w:pPr>
-        <w:pStyle w:val="Heading2"/>
-      </w:pPr>
-      <w:r>
-        <w:rPr>
-          <w:rFonts w:ascii="STSong" w:hAnsi="STSong" w:eastAsia="STSong"/>
+          <w:rFonts w:ascii="Arial Unicode MS" w:hAnsi="Arial Unicode MS" w:eastAsia="Arial Unicode MS"/>
           <w:b/>
           <w:i w:val="0"/>
           <w:color w:val="A86543"/>
@@ -1697,13 +2109,13 @@
       </w:pPr>
       <w:r>
         <w:rPr>
-          <w:rFonts w:ascii="STSong" w:hAnsi="STSong" w:eastAsia="STSong"/>
+          <w:rFonts w:ascii="Arial Unicode MS" w:hAnsi="Arial Unicode MS" w:eastAsia="Arial Unicode MS"/>
           <w:b/>
           <w:i w:val="0"/>
           <w:color w:val="222222"/>
           <w:sz w:val="23"/>
         </w:rPr>
-        <w:t>3-1 日 内 学生会主席专属休息室</w:t>
+        <w:t>3-1 日 内 学生会会长休息室</w:t>
       </w:r>
     </w:p>
     <w:p>
@@ -1713,29 +2125,29 @@
       </w:pPr>
       <w:r>
         <w:rPr>
-          <w:rFonts w:ascii="STSong" w:hAnsi="STSong" w:eastAsia="STSong"/>
+          <w:rFonts w:ascii="Arial Unicode MS" w:hAnsi="Arial Unicode MS" w:eastAsia="Arial Unicode MS"/>
           <w:b/>
           <w:i w:val="0"/>
           <w:color w:val="222222"/>
           <w:sz w:val="21"/>
         </w:rPr>
-        <w:t>人物：Ivy（外貌Ryder）、Ryder（外貌Ivy）</w:t>
+        <w:t>人物: Ivy (in Ryder's body)、Ryder (in Ivy's body)</w:t>
       </w:r>
     </w:p>
     <w:p>
       <w:pPr>
         <w:spacing w:after="80"/>
-        <w:ind w:firstLine="0" w:left="227" w:right="113"/>
+        <w:ind w:left="227"/>
       </w:pPr>
       <w:r>
         <w:rPr>
-          <w:rFonts w:ascii="STSong" w:hAnsi="STSong" w:eastAsia="STSong"/>
+          <w:rFonts w:ascii="Arial Unicode MS" w:hAnsi="Arial Unicode MS" w:eastAsia="Arial Unicode MS"/>
           <w:b w:val="0"/>
           <w:i w:val="0"/>
           <w:color w:val="222222"/>
           <w:sz w:val="21"/>
         </w:rPr>
-        <w:t>△两人嘴唇分开，同时睁眼，各自瞪着对方的身体毫无变化。</w:t>
+        <w:t>▲ 两人的嘴唇慢慢分开,同时睁眼睛，各自看向自己的身体，毫无变化。</w:t>
       </w:r>
     </w:p>
     <w:p>
@@ -1745,13 +2157,13 @@
       </w:pPr>
       <w:r>
         <w:rPr>
-          <w:rFonts w:ascii="STSong" w:hAnsi="STSong" w:eastAsia="STSong"/>
+          <w:rFonts w:ascii="Arial Unicode MS" w:hAnsi="Arial Unicode MS" w:eastAsia="Arial Unicode MS"/>
           <w:b/>
           <w:i w:val="0"/>
           <w:color w:val="222222"/>
           <w:sz w:val="21"/>
         </w:rPr>
-        <w:t>Ryder（外貌Ivy）：（疑惑）为什么……没换回来？</w:t>
+        <w:t>Ryder (in Ivy's body): (疑惑) Why... why didn't it work?</w:t>
       </w:r>
     </w:p>
     <w:p>
@@ -1761,13 +2173,13 @@
       </w:pPr>
       <w:r>
         <w:rPr>
-          <w:rFonts w:ascii="STSong" w:hAnsi="STSong" w:eastAsia="STSong"/>
+          <w:rFonts w:ascii="Arial Unicode MS" w:hAnsi="Arial Unicode MS" w:eastAsia="Arial Unicode MS"/>
           <w:b/>
           <w:i w:val="0"/>
           <w:color w:val="222222"/>
           <w:sz w:val="21"/>
         </w:rPr>
-        <w:t>Ivy（外貌Ryder）：（恼羞成怒）你根本在找借口占我便宜！</w:t>
+        <w:t>Ivy (in Ryder's body): (恼羞成怒) You were just making excuses to take advantage of me!</w:t>
       </w:r>
     </w:p>
     <w:p>
@@ -1777,13 +2189,13 @@
       </w:pPr>
       <w:r>
         <w:rPr>
-          <w:rFonts w:ascii="STSong" w:hAnsi="STSong" w:eastAsia="STSong"/>
+          <w:rFonts w:ascii="Arial Unicode MS" w:hAnsi="Arial Unicode MS" w:eastAsia="Arial Unicode MS"/>
           <w:b/>
           <w:i w:val="0"/>
           <w:color w:val="222222"/>
           <w:sz w:val="21"/>
         </w:rPr>
-        <w:t>Ryder（外貌Ivy）： 放心，就算全世界只剩你一个女生，我也不会占你便宜。</w:t>
+        <w:t>Ryder (in Ivy's body): Relax. Even if you were the last girl on Earth, I still wouldn't be interested.</w:t>
       </w:r>
     </w:p>
     <w:p>
@@ -1793,45 +2205,61 @@
       </w:pPr>
       <w:r>
         <w:rPr>
-          <w:rFonts w:ascii="STSong" w:hAnsi="STSong" w:eastAsia="STSong"/>
+          <w:rFonts w:ascii="Arial Unicode MS" w:hAnsi="Arial Unicode MS" w:eastAsia="Arial Unicode MS"/>
           <w:b/>
           <w:i w:val="0"/>
           <w:color w:val="222222"/>
           <w:sz w:val="21"/>
         </w:rPr>
-        <w:t>Ivy（外貌Ryder）： 少自恋了，我还对你没兴趣呢。</w:t>
+        <w:t>Ivy (in Ryder's body): Oh please. Like I'd ever be into you either.</w:t>
       </w:r>
     </w:p>
     <w:p>
       <w:pPr>
         <w:spacing w:after="80"/>
-        <w:ind w:firstLine="0" w:left="227" w:right="113"/>
+        <w:ind w:left="227"/>
       </w:pPr>
       <w:r>
         <w:rPr>
-          <w:rFonts w:ascii="STSong" w:hAnsi="STSong" w:eastAsia="STSong"/>
+          <w:rFonts w:ascii="Arial Unicode MS" w:hAnsi="Arial Unicode MS" w:eastAsia="Arial Unicode MS"/>
           <w:b w:val="0"/>
           <w:i w:val="0"/>
           <w:color w:val="222222"/>
           <w:sz w:val="21"/>
         </w:rPr>
-        <w:t>△ 话没说完，Ivy（外貌Ryder）推开Ryder（外貌Ivy）站起来，走了两步又忽然停住，双腿内八并拢在一起，表情扭捏。</w:t>
+        <w:t>▲ 话音刚落,Ivy (in Ryder's body) 猛地推开 Ryder (in Ivy's body),站起身准备离开。</w:t>
       </w:r>
     </w:p>
     <w:p>
       <w:pPr>
         <w:spacing w:after="80"/>
-        <w:ind w:left="964" w:hanging="964"/>
+        <w:ind w:left="227"/>
       </w:pPr>
       <w:r>
         <w:rPr>
-          <w:rFonts w:ascii="STSong" w:hAnsi="STSong" w:eastAsia="STSong"/>
+          <w:rFonts w:ascii="Arial Unicode MS" w:hAnsi="Arial Unicode MS" w:eastAsia="Arial Unicode MS"/>
+          <w:b w:val="0"/>
+          <w:i w:val="0"/>
+          <w:color w:val="222222"/>
+          <w:sz w:val="21"/>
+        </w:rPr>
+        <w:t>▲ 她走了两步,突然停住,双腿内八并拢在一起,表情变得扭捏不安。</w:t>
+      </w:r>
+    </w:p>
+    <w:p>
+      <w:pPr>
+        <w:spacing w:after="80"/>
+        <w:ind w:left="964" w:hanging="964"/>
+      </w:pPr>
+      <w:r>
+        <w:rPr>
+          <w:rFonts w:ascii="Arial Unicode MS" w:hAnsi="Arial Unicode MS" w:eastAsia="Arial Unicode MS"/>
           <w:b/>
           <w:i w:val="0"/>
           <w:color w:val="222222"/>
           <w:sz w:val="21"/>
         </w:rPr>
-        <w:t>Ryder（外貌Ivy）：（警告对方）说了别用我的身体做这种动作。</w:t>
+        <w:t>Ryder (in Ivy's body): (皱眉,警告) I told you—stop making that face with my body.</w:t>
       </w:r>
     </w:p>
     <w:p>
@@ -1841,29 +2269,29 @@
       </w:pPr>
       <w:r>
         <w:rPr>
-          <w:rFonts w:ascii="STSong" w:hAnsi="STSong" w:eastAsia="STSong"/>
+          <w:rFonts w:ascii="Arial Unicode MS" w:hAnsi="Arial Unicode MS" w:eastAsia="Arial Unicode MS"/>
           <w:b/>
           <w:i w:val="0"/>
           <w:color w:val="222222"/>
           <w:sz w:val="21"/>
         </w:rPr>
-        <w:t>Ivy（外貌Ryder）：（低头，小声嘟囔）我……我想尿尿。</w:t>
+        <w:t>Ivy (in Ryder's body): (低头,小声嘟囔,越说越小声) I... I need to pee.</w:t>
       </w:r>
     </w:p>
     <w:p>
       <w:pPr>
         <w:spacing w:after="80"/>
-        <w:ind w:firstLine="0" w:left="227" w:right="113"/>
+        <w:ind w:left="227"/>
       </w:pPr>
       <w:r>
         <w:rPr>
-          <w:rFonts w:ascii="STSong" w:hAnsi="STSong" w:eastAsia="STSong"/>
+          <w:rFonts w:ascii="Arial Unicode MS" w:hAnsi="Arial Unicode MS" w:eastAsia="Arial Unicode MS"/>
           <w:b w:val="0"/>
           <w:i w:val="0"/>
           <w:color w:val="222222"/>
           <w:sz w:val="21"/>
         </w:rPr>
-        <w:t>△Ivy（外貌Ryder）说完，又扭动了一下身体，双手捂住腹部。</w:t>
+        <w:t>▲ Ivy (in Ryder's body) 说完,又扭动了一下身体,双手捂住小腹,表情痛苦。</w:t>
       </w:r>
     </w:p>
     <w:p>
@@ -1873,13 +2301,13 @@
       </w:pPr>
       <w:r>
         <w:rPr>
-          <w:rFonts w:ascii="STSong" w:hAnsi="STSong" w:eastAsia="STSong"/>
+          <w:rFonts w:ascii="Arial Unicode MS" w:hAnsi="Arial Unicode MS" w:eastAsia="Arial Unicode MS"/>
           <w:b/>
           <w:i w:val="0"/>
           <w:color w:val="222222"/>
           <w:sz w:val="21"/>
         </w:rPr>
-        <w:t>Ryder（外貌Ivy）：(无奈地扶额)那你去呀？</w:t>
+        <w:t>Ryder (in Ivy's body): (无奈地扶额) Then... go?</w:t>
       </w:r>
     </w:p>
     <w:p>
@@ -1889,29 +2317,45 @@
       </w:pPr>
       <w:r>
         <w:rPr>
-          <w:rFonts w:ascii="STSong" w:hAnsi="STSong" w:eastAsia="STSong"/>
+          <w:rFonts w:ascii="Arial Unicode MS" w:hAnsi="Arial Unicode MS" w:eastAsia="Arial Unicode MS"/>
           <w:b/>
           <w:i w:val="0"/>
           <w:color w:val="222222"/>
           <w:sz w:val="21"/>
         </w:rPr>
-        <w:t>Ivy（外貌Ryder）：我……我一个女生！怎么用男人的身体上厕所。</w:t>
+        <w:t>Ivy (in Ryder's body): I'm a GIRL! How am I supposed to pee with—with this?!</w:t>
       </w:r>
     </w:p>
     <w:p>
       <w:pPr>
         <w:spacing w:after="80"/>
-        <w:ind w:left="964" w:hanging="964"/>
+        <w:ind w:left="227"/>
       </w:pPr>
       <w:r>
         <w:rPr>
-          <w:rFonts w:ascii="STSong" w:hAnsi="STSong" w:eastAsia="STSong"/>
+          <w:rFonts w:ascii="Arial Unicode MS" w:hAnsi="Arial Unicode MS" w:eastAsia="Arial Unicode MS"/>
+          <w:b w:val="0"/>
+          <w:i w:val="0"/>
+          <w:color w:val="222222"/>
+          <w:sz w:val="21"/>
+        </w:rPr>
+        <w:t>▲ 她指向自己(Ryder的身体)下半身,脸涨得通红。</w:t>
+      </w:r>
+    </w:p>
+    <w:p>
+      <w:pPr>
+        <w:spacing w:after="80"/>
+        <w:ind w:left="964" w:hanging="964"/>
+      </w:pPr>
+      <w:r>
+        <w:rPr>
+          <w:rFonts w:ascii="Arial Unicode MS" w:hAnsi="Arial Unicode MS" w:eastAsia="Arial Unicode MS"/>
           <w:b/>
           <w:i w:val="0"/>
           <w:color w:val="222222"/>
           <w:sz w:val="21"/>
         </w:rPr>
-        <w:t>Ryder（外貌Ivy）：那就憋着。</w:t>
+        <w:t>Ryder (in Ivy's body): (耸肩,冷漠) Then hold it.</w:t>
       </w:r>
     </w:p>
     <w:p>
@@ -1921,29 +2365,29 @@
       </w:pPr>
       <w:r>
         <w:rPr>
-          <w:rFonts w:ascii="STSong" w:hAnsi="STSong" w:eastAsia="STSong"/>
+          <w:rFonts w:ascii="Arial Unicode MS" w:hAnsi="Arial Unicode MS" w:eastAsia="Arial Unicode MS"/>
           <w:b/>
           <w:i w:val="0"/>
           <w:color w:val="222222"/>
           <w:sz w:val="21"/>
         </w:rPr>
-        <w:t>Ivy（外貌Ryder）：你！你还有没有良心……再说这是你的身体，憋坏了也是你难受。</w:t>
+        <w:t>Ivy (in Ryder's body): (愤怒) Are you kidding me?! And besides—this is your body! If something breaks, you're the one who's screwed!</w:t>
       </w:r>
     </w:p>
     <w:p>
       <w:pPr>
         <w:spacing w:after="80"/>
-        <w:ind w:firstLine="0" w:left="227" w:right="113"/>
+        <w:ind w:left="227"/>
       </w:pPr>
       <w:r>
         <w:rPr>
-          <w:rFonts w:ascii="STSong" w:hAnsi="STSong" w:eastAsia="STSong"/>
+          <w:rFonts w:ascii="Arial Unicode MS" w:hAnsi="Arial Unicode MS" w:eastAsia="Arial Unicode MS"/>
           <w:b w:val="0"/>
           <w:i w:val="0"/>
           <w:color w:val="222222"/>
           <w:sz w:val="21"/>
         </w:rPr>
-        <w:t>△Ryder（外貌Ivy） 啧了一声，一把将她拽进旁边的洗手间。</w:t>
+        <w:t>▲ Ryder (in Ivy's body) 啧了一声,一把抓住她的手腕,把她拽向旁边的洗手间。</w:t>
       </w:r>
     </w:p>
     <w:p>
@@ -1953,13 +2397,13 @@
       </w:pPr>
       <w:r>
         <w:rPr>
-          <w:rFonts w:ascii="STSong" w:hAnsi="STSong" w:eastAsia="STSong"/>
+          <w:rFonts w:ascii="Arial Unicode MS" w:hAnsi="Arial Unicode MS" w:eastAsia="Arial Unicode MS"/>
           <w:b/>
           <w:i w:val="0"/>
           <w:color w:val="222222"/>
           <w:sz w:val="21"/>
         </w:rPr>
-        <w:t>Ryder（外貌Ivy）：上吧。</w:t>
+        <w:t>Ryder (in Ivy's body): (不耐烦) Fine. Let's go.</w:t>
       </w:r>
     </w:p>
     <w:p>
@@ -1968,7 +2412,7 @@
       </w:pPr>
       <w:r>
         <w:rPr>
-          <w:rFonts w:ascii="STSong" w:hAnsi="STSong" w:eastAsia="STSong"/>
+          <w:rFonts w:ascii="Arial Unicode MS" w:hAnsi="Arial Unicode MS" w:eastAsia="Arial Unicode MS"/>
           <w:b/>
           <w:i w:val="0"/>
           <w:color w:val="222222"/>
@@ -1984,45 +2428,77 @@
       </w:pPr>
       <w:r>
         <w:rPr>
-          <w:rFonts w:ascii="STSong" w:hAnsi="STSong" w:eastAsia="STSong"/>
+          <w:rFonts w:ascii="Arial Unicode MS" w:hAnsi="Arial Unicode MS" w:eastAsia="Arial Unicode MS"/>
           <w:b/>
           <w:i w:val="0"/>
           <w:color w:val="222222"/>
           <w:sz w:val="21"/>
         </w:rPr>
-        <w:t>人物：Ivy（外貌Ryder）、Ryder（外貌Ivy）</w:t>
+        <w:t>人物: Ivy (in Ryder's body)、Ryder (in Ivy's body)</w:t>
       </w:r>
     </w:p>
     <w:p>
       <w:pPr>
         <w:spacing w:after="80"/>
-        <w:ind w:firstLine="0" w:left="227" w:right="113"/>
+        <w:ind w:left="227"/>
       </w:pPr>
       <w:r>
         <w:rPr>
-          <w:rFonts w:ascii="STSong" w:hAnsi="STSong" w:eastAsia="STSong"/>
+          <w:rFonts w:ascii="Arial Unicode MS" w:hAnsi="Arial Unicode MS" w:eastAsia="Arial Unicode MS"/>
           <w:b w:val="0"/>
           <w:i w:val="0"/>
           <w:color w:val="222222"/>
           <w:sz w:val="21"/>
         </w:rPr>
-        <w:t>△Ivy（外貌 Ryder）站在便池前，紧闭双眼，慢慢拽开浴巾，又缩回手，面红耳赤地把脸别到一边。</w:t>
+        <w:t>▲ Ivy (in Ryder's body) 站在便池前,紧闭双眼,深吸一口气。</w:t>
       </w:r>
     </w:p>
     <w:p>
       <w:pPr>
         <w:spacing w:after="80"/>
-        <w:ind w:left="964" w:hanging="964"/>
+        <w:ind w:left="227"/>
       </w:pPr>
       <w:r>
         <w:rPr>
-          <w:rFonts w:ascii="STSong" w:hAnsi="STSong" w:eastAsia="STSong"/>
+          <w:rFonts w:ascii="Arial Unicode MS" w:hAnsi="Arial Unicode MS" w:eastAsia="Arial Unicode MS"/>
+          <w:b w:val="0"/>
+          <w:i w:val="0"/>
+          <w:color w:val="222222"/>
+          <w:sz w:val="21"/>
+        </w:rPr>
+        <w:t>▲ 她慢慢伸手去拽浴巾,手指刚碰到布料边缘，又猛地缩回手。</w:t>
+      </w:r>
+    </w:p>
+    <w:p>
+      <w:pPr>
+        <w:spacing w:after="80"/>
+        <w:ind w:left="227"/>
+      </w:pPr>
+      <w:r>
+        <w:rPr>
+          <w:rFonts w:ascii="Arial Unicode MS" w:hAnsi="Arial Unicode MS" w:eastAsia="Arial Unicode MS"/>
+          <w:b w:val="0"/>
+          <w:i w:val="0"/>
+          <w:color w:val="222222"/>
+          <w:sz w:val="21"/>
+        </w:rPr>
+        <w:t>▲ 她把脸别到一边,耳根和脖子都红透了。</w:t>
+      </w:r>
+    </w:p>
+    <w:p>
+      <w:pPr>
+        <w:spacing w:after="80"/>
+        <w:ind w:left="964" w:hanging="964"/>
+      </w:pPr>
+      <w:r>
+        <w:rPr>
+          <w:rFonts w:ascii="Arial Unicode MS" w:hAnsi="Arial Unicode MS" w:eastAsia="Arial Unicode MS"/>
           <w:b/>
           <w:i w:val="0"/>
           <w:color w:val="222222"/>
           <w:sz w:val="21"/>
         </w:rPr>
-        <w:t>Ivy（外貌Ryder）：（朝着洗手间外喊）我做不到！你……你帮我！</w:t>
+        <w:t>Ivy (in Ryder's body): (朝着洗手间外喊) I can't do this! You—you have to help me!</w:t>
       </w:r>
     </w:p>
     <w:p>
@@ -2031,13 +2507,13 @@
       </w:pPr>
       <w:r>
         <w:rPr>
-          <w:rFonts w:ascii="STSong" w:hAnsi="STSong" w:eastAsia="STSong"/>
+          <w:rFonts w:ascii="Arial Unicode MS" w:hAnsi="Arial Unicode MS" w:eastAsia="Arial Unicode MS"/>
           <w:b/>
           <w:i w:val="0"/>
           <w:color w:val="222222"/>
           <w:sz w:val="23"/>
         </w:rPr>
-        <w:t>3-3 日 内 学生会主席专属休息室</w:t>
+        <w:t>3-3 日 内 Student Council President's Lounge(学生会会长休息室)</w:t>
       </w:r>
     </w:p>
     <w:p>
@@ -2047,29 +2523,29 @@
       </w:pPr>
       <w:r>
         <w:rPr>
-          <w:rFonts w:ascii="STSong" w:hAnsi="STSong" w:eastAsia="STSong"/>
+          <w:rFonts w:ascii="Arial Unicode MS" w:hAnsi="Arial Unicode MS" w:eastAsia="Arial Unicode MS"/>
           <w:b/>
           <w:i w:val="0"/>
           <w:color w:val="222222"/>
           <w:sz w:val="21"/>
         </w:rPr>
-        <w:t>人物：Ivy（外貌Ryder）、Ryder（外貌Ivy）</w:t>
+        <w:t>人物: Ivy (in Ryder's body)、Ryder (in Ivy's body)</w:t>
       </w:r>
     </w:p>
     <w:p>
       <w:pPr>
         <w:spacing w:after="80"/>
-        <w:ind w:firstLine="0" w:left="227" w:right="113"/>
+        <w:ind w:left="227"/>
       </w:pPr>
       <w:r>
         <w:rPr>
-          <w:rFonts w:ascii="STSong" w:hAnsi="STSong" w:eastAsia="STSong"/>
+          <w:rFonts w:ascii="Arial Unicode MS" w:hAnsi="Arial Unicode MS" w:eastAsia="Arial Unicode MS"/>
           <w:b w:val="0"/>
           <w:i w:val="0"/>
           <w:color w:val="222222"/>
           <w:sz w:val="21"/>
         </w:rPr>
-        <w:t>△ Ryder（外貌Ivy）靠在洗手间门口。</w:t>
+        <w:t>▲ Ryder (in Ivy's body) 靠在洗手间门框上,抱着胳膊,嘴角勾起一抹坏笑。</w:t>
       </w:r>
     </w:p>
     <w:p>
@@ -2079,45 +2555,61 @@
       </w:pPr>
       <w:r>
         <w:rPr>
-          <w:rFonts w:ascii="STSong" w:hAnsi="STSong" w:eastAsia="STSong"/>
+          <w:rFonts w:ascii="Arial Unicode MS" w:hAnsi="Arial Unicode MS" w:eastAsia="Arial Unicode MS"/>
           <w:b/>
           <w:i w:val="0"/>
           <w:color w:val="222222"/>
           <w:sz w:val="21"/>
         </w:rPr>
-        <w:t>Ryder（外貌Ivy）：怎么帮你？</w:t>
+        <w:t>Ryder (in Ivy's body): (挑眉,故意拖长语调) Help you?</w:t>
       </w:r>
     </w:p>
     <w:p>
       <w:pPr>
         <w:spacing w:after="80"/>
-        <w:ind w:left="964" w:hanging="964"/>
+        <w:ind w:left="227"/>
       </w:pPr>
       <w:r>
         <w:rPr>
-          <w:rFonts w:ascii="STSong" w:hAnsi="STSong" w:eastAsia="STSong"/>
+          <w:rFonts w:ascii="Arial Unicode MS" w:hAnsi="Arial Unicode MS" w:eastAsia="Arial Unicode MS"/>
+          <w:b w:val="0"/>
+          <w:i w:val="0"/>
+          <w:color w:val="222222"/>
+          <w:sz w:val="21"/>
+        </w:rPr>
+        <w:t>▲ 他停顿一秒,然后坏笑更明显,眼神玩味地盯着洗手间里的 Ivy。</w:t>
+      </w:r>
+    </w:p>
+    <w:p>
+      <w:pPr>
+        <w:spacing w:after="80"/>
+        <w:ind w:left="964" w:hanging="964"/>
+      </w:pPr>
+      <w:r>
+        <w:rPr>
+          <w:rFonts w:ascii="Arial Unicode MS" w:hAnsi="Arial Unicode MS" w:eastAsia="Arial Unicode MS"/>
           <w:b/>
           <w:i w:val="0"/>
           <w:color w:val="222222"/>
           <w:sz w:val="21"/>
         </w:rPr>
-        <w:t>Ryder（外貌Ivy）：（坏笑一下，盯着Ivy）用手你的手帮你吗？</w:t>
+        <w:t>Ryder (in Ivy's body): (继续挑衅) You want me to... Use your hands to help you out?</w:t>
       </w:r>
     </w:p>
     <w:p>
       <w:pPr>
         <w:spacing w:after="80"/>
-        <w:ind w:firstLine="0" w:left="227" w:right="113"/>
+        <w:ind w:left="227"/>
       </w:pPr>
       <w:r>
         <w:rPr>
-          <w:rFonts w:ascii="STSong" w:hAnsi="STSong" w:eastAsia="STSong"/>
+          <w:rFonts w:ascii="Arial Unicode MS" w:hAnsi="Arial Unicode MS" w:eastAsia="Arial Unicode MS"/>
           <w:b w:val="0"/>
           <w:i w:val="0"/>
           <w:color w:val="222222"/>
           <w:sz w:val="21"/>
         </w:rPr>
-        <w:t>△洗手间内，Ivy（外貌Ryder）愣住，耳根红到脖子，又羞又恼。</w:t>
+        <w:t>▲ Ivy (in Ryder's body) 的脸从耳根红到脖子。</w:t>
       </w:r>
     </w:p>
     <w:p>
@@ -2127,20 +2619,20 @@
       </w:pPr>
       <w:r>
         <w:rPr>
-          <w:rFonts w:ascii="STSong" w:hAnsi="STSong" w:eastAsia="STSong"/>
+          <w:rFonts w:ascii="Arial Unicode MS" w:hAnsi="Arial Unicode MS" w:eastAsia="Arial Unicode MS"/>
           <w:b/>
           <w:i w:val="0"/>
           <w:color w:val="222222"/>
           <w:sz w:val="21"/>
         </w:rPr>
-        <w:t>Ivy（外貌Ryder）：啊啊啊！滚啊！</w:t>
+        <w:t>Ivy (in Ryder's body): (尖叫,声音破音) AHHH! GET OUT! JUST GET OUT!</w:t>
       </w:r>
     </w:p>
     <w:sectPr>
       <w:headerReference w:type="default" r:id="rId9"/>
       <w:footerReference w:type="default" r:id="rId10"/>
       <w:pgSz w:w="12240" w:h="15840"/>
-      <w:pgMar w:top="1020" w:right="1247" w:bottom="1020" w:left="1247" w:header="454" w:footer="454" w:gutter="0"/>
+      <w:pgMar w:top="1020" w:right="1247" w:bottom="1020" w:left="1247" w:header="720" w:footer="720" w:gutter="0"/>
       <w:cols w:space="720"/>
       <w:docGrid w:linePitch="360"/>
     </w:sectPr>
@@ -2157,9 +2649,7 @@
     </w:pPr>
     <w:r>
       <w:rPr>
-        <w:rFonts w:ascii="STSong" w:hAnsi="STSong" w:eastAsia="STSong"/>
-        <w:b w:val="0"/>
-        <w:i w:val="0"/>
+        <w:rFonts w:ascii="Arial Unicode MS" w:hAnsi="Arial Unicode MS"/>
         <w:color w:val="6D6862"/>
         <w:sz w:val="17"/>
       </w:rPr>
@@ -2179,9 +2669,8 @@
     </w:pPr>
     <w:r>
       <w:rPr>
-        <w:rFonts w:ascii="STSong" w:hAnsi="STSong" w:eastAsia="STSong"/>
-        <w:b/>
-        <w:i w:val="0"/>
+        <w:rFonts w:ascii="Arial Unicode MS" w:hAnsi="Arial Unicode MS"/>
+        <w:b/>
         <w:color w:val="A86543"/>
         <w:sz w:val="17"/>
       </w:rPr>
@@ -2555,10 +3044,10 @@
     <w:qFormat/>
     <w:rsid w:val="00FC693F"/>
     <w:pPr>
-      <w:spacing w:after="100" w:line="283" w:lineRule="auto"/>
+      <w:spacing w:after="120" w:line="283" w:lineRule="auto"/>
     </w:pPr>
     <w:rPr>
-      <w:rFonts w:ascii="STSong" w:hAnsi="STSong" w:eastAsia="STSong"/>
+      <w:rFonts w:ascii="Arial Unicode MS" w:hAnsi="Arial Unicode MS" w:eastAsia="Arial Unicode MS"/>
       <w:color w:val="222222"/>
       <w:sz w:val="21"/>
     </w:rPr>
@@ -2622,7 +3111,7 @@
       <w:outlineLvl w:val="0"/>
     </w:pPr>
     <w:rPr>
-      <w:rFonts w:asciiTheme="majorHAnsi" w:eastAsiaTheme="majorEastAsia" w:hAnsiTheme="majorHAnsi" w:cstheme="majorBidi" w:ascii="STSong" w:hAnsi="STSong" w:eastAsia="STSong"/>
+      <w:rFonts w:asciiTheme="majorHAnsi" w:eastAsiaTheme="majorEastAsia" w:hAnsiTheme="majorHAnsi" w:cstheme="majorBidi" w:ascii="Arial Unicode MS" w:hAnsi="Arial Unicode MS" w:eastAsia="Arial Unicode MS"/>
       <w:b/>
       <w:bCs/>
       <w:color w:val="222222"/>
@@ -2646,7 +3135,7 @@
       <w:outlineLvl w:val="1"/>
     </w:pPr>
     <w:rPr>
-      <w:rFonts w:asciiTheme="majorHAnsi" w:eastAsiaTheme="majorEastAsia" w:hAnsiTheme="majorHAnsi" w:cstheme="majorBidi" w:ascii="STSong" w:hAnsi="STSong" w:eastAsia="STSong"/>
+      <w:rFonts w:asciiTheme="majorHAnsi" w:eastAsiaTheme="majorEastAsia" w:hAnsiTheme="majorHAnsi" w:cstheme="majorBidi" w:ascii="Arial Unicode MS" w:hAnsi="Arial Unicode MS" w:eastAsia="Arial Unicode MS"/>
       <w:b/>
       <w:bCs/>
       <w:color w:val="A86543"/>
@@ -2670,7 +3159,7 @@
       <w:outlineLvl w:val="2"/>
     </w:pPr>
     <w:rPr>
-      <w:rFonts w:asciiTheme="majorHAnsi" w:eastAsiaTheme="majorEastAsia" w:hAnsiTheme="majorHAnsi" w:cstheme="majorBidi" w:ascii="STSong" w:hAnsi="STSong" w:eastAsia="STSong"/>
+      <w:rFonts w:asciiTheme="majorHAnsi" w:eastAsiaTheme="majorEastAsia" w:hAnsiTheme="majorHAnsi" w:cstheme="majorBidi" w:ascii="Arial Unicode MS" w:hAnsi="Arial Unicode MS" w:eastAsia="Arial Unicode MS"/>
       <w:b/>
       <w:bCs/>
       <w:color w:val="222222"/>
@@ -2690,17 +3179,16 @@
     <w:pPr>
       <w:keepNext/>
       <w:keepLines/>
-      <w:spacing w:before="160" w:after="60"/>
+      <w:spacing w:before="200" w:after="0"/>
       <w:outlineLvl w:val="3"/>
     </w:pPr>
     <w:rPr>
-      <w:rFonts w:asciiTheme="majorHAnsi" w:eastAsiaTheme="majorEastAsia" w:hAnsiTheme="majorHAnsi" w:cstheme="majorBidi" w:ascii="STSong" w:hAnsi="STSong" w:eastAsia="STSong"/>
+      <w:rFonts w:asciiTheme="majorHAnsi" w:eastAsiaTheme="majorEastAsia" w:hAnsiTheme="majorHAnsi" w:cstheme="majorBidi"/>
       <w:b/>
       <w:bCs/>
       <w:i/>
       <w:iCs/>
-      <w:color w:val="6D6862"/>
-      <w:sz w:val="21"/>
+      <w:color w:val="4F81BD" w:themeColor="accent1"/>
     </w:rPr>
   </w:style>
   <w:style w:type="paragraph" w:styleId="Heading5">

</xml_diff>